<commit_message>
479: reweight to 50/10/40, FERPA-aware sharing note, lecture-1 corrections
</commit_message>
<xml_diff>
--- a/courses/479-fall-2026/syllabus/University of Illinois Urbana-Champaign Syllabus 479 Fall 2026.docx
+++ b/courses/479-fall-2026/syllabus/University of Illinois Urbana-Champaign Syllabus 479 Fall 2026.docx
@@ -33,7 +33,15 @@
         </w:numPr>
       </w:pPr>
       <w:r>
-        <w:t>Duration: Part of Term A (First Eight Weeks); 24 August – 16 October 2026. Section B, CRN 79602 (undergraduate) and Section ONL, CRN 79603 (graduate) meet together as a single seminar under this syllabus.</w:t>
+        <w:t xml:space="preserve">Duration: Part of Term A (First Eight Weeks); 24 August – 16 October 2026. Section B, CRN 79602 (undergraduate) and Section ONL, CRN 79603 (graduate) </w:t>
+      </w:r>
+      <w:proofErr w:type="gramStart"/>
+      <w:r>
+        <w:t>meet together</w:t>
+      </w:r>
+      <w:proofErr w:type="gramEnd"/>
+      <w:r>
+        <w:t xml:space="preserve"> as a single seminar under this syllabus.</w:t>
       </w:r>
     </w:p>
     <w:p>
@@ -63,12 +71,26 @@
         <w:rPr>
           <w:spacing w:val="-7"/>
         </w:rPr>
-        <w:t xml:space="preserve">Format: Online, mixed synchronous and asynchronous. The weekly seminar meets live over Zoom and is the centre of the course. Readings, the weekly AI chat session, and the revision of your own written responses are completed asynchronously between sessions. </w:t>
-      </w:r>
+        <w:t xml:space="preserve">Format: Online, mixed synchronous and asynchronous. The weekly seminar meets live over Zoom and is the </w:t>
+      </w:r>
+      <w:proofErr w:type="spellStart"/>
       <w:r>
         <w:rPr>
           <w:spacing w:val="-7"/>
         </w:rPr>
+        <w:t>centre</w:t>
+      </w:r>
+      <w:proofErr w:type="spellEnd"/>
+      <w:r>
+        <w:rPr>
+          <w:spacing w:val="-7"/>
+        </w:rPr>
+        <w:t xml:space="preserve"> of the course. Readings, the weekly AI chat session, and the revision of your own written responses are completed asynchronously between sessions. </w:t>
+      </w:r>
+      <w:r>
+        <w:rPr>
+          <w:spacing w:val="-7"/>
+        </w:rPr>
         <w:t>The lecture component of the s</w:t>
       </w:r>
       <w:r>
@@ -105,8 +127,16 @@
         <w:rPr>
           <w:spacing w:val="-7"/>
         </w:rPr>
-        <w:t xml:space="preserve"> to CGScholar</w:t>
-      </w:r>
+        <w:t xml:space="preserve"> to </w:t>
+      </w:r>
+      <w:proofErr w:type="spellStart"/>
+      <w:r>
+        <w:rPr>
+          <w:spacing w:val="-7"/>
+        </w:rPr>
+        <w:t>CGScholar</w:t>
+      </w:r>
+      <w:proofErr w:type="spellEnd"/>
       <w:r>
         <w:rPr>
           <w:spacing w:val="-7"/>
@@ -125,12 +155,14 @@
       <w:r>
         <w:t xml:space="preserve">Location: Online. The Zoom link is posted on </w:t>
       </w:r>
+      <w:proofErr w:type="spellStart"/>
       <w:r>
         <w:rPr>
           <w:spacing w:val="-7"/>
         </w:rPr>
         <w:t>CGScholar</w:t>
       </w:r>
+      <w:proofErr w:type="spellEnd"/>
       <w:r>
         <w:t>. No physical room is assigned.</w:t>
       </w:r>
@@ -259,19 +291,19 @@
         <w:rPr>
           <w:spacing w:val="-3"/>
         </w:rPr>
-        <w:t xml:space="preserve">Office location: Not applicable </w:t>
+        <w:t xml:space="preserve">Office location: </w:t>
       </w:r>
       <w:r>
         <w:rPr>
           <w:spacing w:val="-3"/>
         </w:rPr>
-        <w:t>–</w:t>
+        <w:t>O’Leary Center, Room 10C (for non-Zoom students)</w:t>
       </w:r>
       <w:r>
         <w:rPr>
           <w:spacing w:val="-3"/>
         </w:rPr>
-        <w:t xml:space="preserve"> this course is taught online.</w:t>
+        <w:t>.</w:t>
       </w:r>
     </w:p>
     <w:p>
@@ -320,30 +352,14 @@
       <w:r>
         <w:t xml:space="preserve">Course website: </w:t>
       </w:r>
-      <w:r>
-        <w:fldChar w:fldCharType="begin"/>
-      </w:r>
-      <w:r>
-        <w:instrText>HYPERLINK "</w:instrText>
-      </w:r>
-      <w:r>
-        <w:instrText>https://cgscholar.com/communities/150</w:instrText>
-      </w:r>
-      <w:r>
-        <w:instrText>"</w:instrText>
-      </w:r>
-      <w:r>
-        <w:fldChar w:fldCharType="separate"/>
-      </w:r>
-      <w:r>
-        <w:rPr>
-          <w:rStyle w:val="Hyperlink"/>
-        </w:rPr>
-        <w:t>https://cgscholar.com/communities/150</w:t>
-      </w:r>
-      <w:r>
-        <w:fldChar w:fldCharType="end"/>
-      </w:r>
+      <w:hyperlink r:id="rId10" w:history="1">
+        <w:r>
+          <w:rPr>
+            <w:rStyle w:val="Hyperlink"/>
+          </w:rPr>
+          <w:t>https://cgscholar.com/communities/150</w:t>
+        </w:r>
+      </w:hyperlink>
       <w:r>
         <w:t xml:space="preserve"> </w:t>
       </w:r>
@@ -357,9 +373,15 @@
         </w:numPr>
       </w:pPr>
       <w:r>
-        <w:t xml:space="preserve">Assessment document: </w:t>
-      </w:r>
-      <w:hyperlink r:id="rId10" w:history="1">
+        <w:t>Assessment document</w:t>
+      </w:r>
+      <w:r>
+        <w:t xml:space="preserve"> template</w:t>
+      </w:r>
+      <w:r>
+        <w:t xml:space="preserve">: </w:t>
+      </w:r>
+      <w:hyperlink r:id="rId11" w:history="1">
         <w:r>
           <w:rPr>
             <w:rStyle w:val="Hyperlink"/>
@@ -475,16 +497,60 @@
         </w:rPr>
         <w:t xml:space="preserve"> recent advances in machine learning. </w:t>
       </w:r>
+      <w:proofErr w:type="gramStart"/>
       <w:r>
         <w:rPr>
           <w:spacing w:val="-2"/>
         </w:rPr>
-        <w:t xml:space="preserve">So while we will certainly focus on these advances themselves, we will also consider what they mean for what it means for us – humans – to learn as well. </w:t>
-      </w:r>
+        <w:t>So</w:t>
+      </w:r>
+      <w:proofErr w:type="gramEnd"/>
       <w:r>
         <w:rPr>
           <w:spacing w:val="-2"/>
         </w:rPr>
+        <w:t xml:space="preserve"> while we will certainly focus on these advances themselves, we will also consider what the</w:t>
+      </w:r>
+      <w:r>
+        <w:rPr>
+          <w:spacing w:val="-2"/>
+        </w:rPr>
+        <w:t>ir implications for us</w:t>
+      </w:r>
+      <w:r>
+        <w:rPr>
+          <w:spacing w:val="-2"/>
+        </w:rPr>
+        <w:t xml:space="preserve"> – humans – </w:t>
+      </w:r>
+      <w:r>
+        <w:rPr>
+          <w:spacing w:val="-2"/>
+        </w:rPr>
+        <w:t xml:space="preserve">and how we </w:t>
+      </w:r>
+      <w:r>
+        <w:rPr>
+          <w:spacing w:val="-2"/>
+        </w:rPr>
+        <w:t>learn</w:t>
+      </w:r>
+      <w:r>
+        <w:rPr>
+          <w:spacing w:val="-2"/>
+        </w:rPr>
+        <w:t xml:space="preserve"> and teach</w:t>
+      </w:r>
+      <w:r>
+        <w:rPr>
+          <w:spacing w:val="-2"/>
+        </w:rPr>
+        <w:t xml:space="preserve"> as well. </w:t>
+      </w:r>
+      <w:r>
+        <w:rPr>
+          <w:spacing w:val="-2"/>
+        </w:rPr>
         <w:t xml:space="preserve">The course takes the point of view that learning has always been tied to technical systems, from the stylus to the Internet. </w:t>
       </w:r>
       <w:r>
@@ -541,85 +607,93 @@
         <w:rPr>
           <w:spacing w:val="-2"/>
         </w:rPr>
-        <w:t>To explore such questions, and to consider the future</w:t>
+        <w:t xml:space="preserve">To explore such questions, and to consider the future, near and far, of education, paradoxically we go back in time. Back, precisely, to the work of </w:t>
       </w:r>
       <w:r>
         <w:rPr>
           <w:spacing w:val="-2"/>
         </w:rPr>
-        <w:t>, near and far,</w:t>
+        <w:t>Georg Wilhelm Friedrich Hegel</w:t>
       </w:r>
       <w:r>
         <w:rPr>
           <w:spacing w:val="-2"/>
         </w:rPr>
-        <w:t xml:space="preserve"> of education, paradoxically we go back in time. Back, precisely, to the work of </w:t>
+        <w:t>, a German philosopher working at the start of the nineteenth century. A time when “machine” might mean a steam engine, perhaps a Jacquard loom, a progenitor of computers. What does he have to offer us here?</w:t>
       </w:r>
       <w:r>
         <w:rPr>
           <w:spacing w:val="-2"/>
         </w:rPr>
-        <w:t>Georg Wilhelm Friedrich Hegel</w:t>
-      </w:r>
-      <w:r>
+        <w:t xml:space="preserve"> </w:t>
+      </w:r>
+    </w:p>
+    <w:p>
+      <w:pPr>
         <w:rPr>
           <w:spacing w:val="-2"/>
         </w:rPr>
-        <w:t>, a German philosopher working at the start of the nineteenth century. A time when “machine” might mean a steam engine, perhaps a Jacquard loom, a progenitor of computers. What does he have to offer us here?</w:t>
-      </w:r>
-    </w:p>
-    <w:p>
-      <w:pPr>
+      </w:pPr>
+      <w:r>
         <w:rPr>
           <w:spacing w:val="-2"/>
         </w:rPr>
-      </w:pPr>
+        <w:t xml:space="preserve">The course will </w:t>
+      </w:r>
       <w:r>
         <w:rPr>
           <w:spacing w:val="-2"/>
         </w:rPr>
-        <w:t xml:space="preserve">The course will </w:t>
+        <w:t>consult</w:t>
       </w:r>
       <w:r>
         <w:rPr>
           <w:spacing w:val="-2"/>
         </w:rPr>
-        <w:t>consult</w:t>
+        <w:t xml:space="preserve"> Hegel</w:t>
       </w:r>
       <w:r>
         <w:rPr>
           <w:spacing w:val="-2"/>
         </w:rPr>
-        <w:t xml:space="preserve"> Hegel</w:t>
+        <w:t xml:space="preserve"> alongside other</w:t>
       </w:r>
       <w:r>
         <w:rPr>
           <w:spacing w:val="-2"/>
         </w:rPr>
-        <w:t xml:space="preserve"> alongside other</w:t>
+        <w:t xml:space="preserve"> more contemporary readings</w:t>
       </w:r>
       <w:r>
         <w:rPr>
           <w:spacing w:val="-2"/>
         </w:rPr>
-        <w:t xml:space="preserve"> more contemporary readings</w:t>
+        <w:t xml:space="preserve"> to review</w:t>
       </w:r>
       <w:r>
         <w:rPr>
           <w:spacing w:val="-2"/>
         </w:rPr>
-        <w:t xml:space="preserve"> to review</w:t>
-      </w:r>
+        <w:t xml:space="preserve"> </w:t>
+      </w:r>
+      <w:proofErr w:type="spellStart"/>
       <w:r>
         <w:rPr>
           <w:spacing w:val="-2"/>
         </w:rPr>
-        <w:t xml:space="preserve"> seven key concepts that each have something to say about facets of learning</w:t>
-      </w:r>
+        <w:t>eigth</w:t>
+      </w:r>
+      <w:proofErr w:type="spellEnd"/>
       <w:r>
         <w:rPr>
           <w:spacing w:val="-2"/>
         </w:rPr>
+        <w:t xml:space="preserve"> key concepts that each have something to say about facets of learning</w:t>
+      </w:r>
+      <w:r>
+        <w:rPr>
+          <w:spacing w:val="-2"/>
+        </w:rPr>
         <w:t>, both human and machinic</w:t>
       </w:r>
       <w:r>
@@ -638,13 +712,57 @@
         <w:rPr>
           <w:spacing w:val="-2"/>
         </w:rPr>
-        <w:t xml:space="preserve">experience, recognition, attention, consciousness, alignment, critique, and </w:t>
+        <w:t>synthesis</w:t>
       </w:r>
       <w:r>
         <w:rPr>
           <w:spacing w:val="-2"/>
         </w:rPr>
+        <w:t xml:space="preserve">, </w:t>
+      </w:r>
+      <w:r>
+        <w:rPr>
+          <w:spacing w:val="-2"/>
+        </w:rPr>
+        <w:t xml:space="preserve">experience, recognition, </w:t>
+      </w:r>
+      <w:r>
+        <w:rPr>
+          <w:spacing w:val="-2"/>
+        </w:rPr>
+        <w:t xml:space="preserve">consciousness, </w:t>
+      </w:r>
+      <w:r>
+        <w:rPr>
+          <w:spacing w:val="-2"/>
+        </w:rPr>
+        <w:t xml:space="preserve">attention, alignment, critique, and </w:t>
+      </w:r>
+      <w:proofErr w:type="spellStart"/>
+      <w:r>
+        <w:rPr>
+          <w:spacing w:val="-2"/>
+        </w:rPr>
+        <w:t>technogenesis</w:t>
+      </w:r>
+      <w:proofErr w:type="spellEnd"/>
+      <w:r>
+        <w:rPr>
+          <w:spacing w:val="-2"/>
+        </w:rPr>
+        <w:t xml:space="preserve"> (or </w:t>
+      </w:r>
+      <w:r>
+        <w:rPr>
+          <w:spacing w:val="-2"/>
+        </w:rPr>
         <w:t>synthesis</w:t>
+      </w:r>
+      <w:r>
+        <w:rPr>
+          <w:spacing w:val="-2"/>
+        </w:rPr>
+        <w:t xml:space="preserve"> again)</w:t>
       </w:r>
       <w:r>
         <w:rPr>
@@ -720,7 +838,7 @@
         </w:numPr>
       </w:pPr>
       <w:r>
-        <w:t>Self-assess their own learning precisely around these questions</w:t>
+        <w:t>Self-assess their own learning around these questions</w:t>
       </w:r>
     </w:p>
     <w:p>
@@ -735,30 +853,63 @@
         <w:t>Develop critical frameworks for evaluating AI in educational contexts</w:t>
       </w:r>
       <w:r>
-        <w:t xml:space="preserve">, with particular emphasis on the idea of </w:t>
+        <w:t>, with particular emphasis on idea</w:t>
+      </w:r>
+      <w:r>
+        <w:t>s</w:t>
+      </w:r>
+      <w:r>
+        <w:t xml:space="preserve"> of </w:t>
       </w:r>
       <w:r>
         <w:rPr>
           <w:i/>
           <w:iCs/>
         </w:rPr>
-        <w:t>immanent critique</w:t>
-      </w:r>
-    </w:p>
-    <w:p>
-      <w:pPr>
-        <w:pStyle w:val="Heading3"/>
-      </w:pPr>
-      <w:r>
-        <w:t>Prerequisites</w:t>
-      </w:r>
-    </w:p>
-    <w:p>
+        <w:t>alignment</w:t>
+      </w:r>
+      <w:r>
+        <w:t xml:space="preserve">, </w:t>
+      </w:r>
       <w:r>
         <w:rPr>
           <w:i/>
           <w:iCs/>
         </w:rPr>
+        <w:t>immanent critique</w:t>
+      </w:r>
+      <w:r>
+        <w:rPr>
+          <w:i/>
+          <w:iCs/>
+        </w:rPr>
+        <w:t xml:space="preserve"> </w:t>
+      </w:r>
+      <w:r>
+        <w:t xml:space="preserve">and </w:t>
+      </w:r>
+      <w:r>
+        <w:rPr>
+          <w:i/>
+          <w:iCs/>
+        </w:rPr>
+        <w:t>synthesis</w:t>
+      </w:r>
+    </w:p>
+    <w:p>
+      <w:pPr>
+        <w:pStyle w:val="Heading3"/>
+      </w:pPr>
+      <w:r>
+        <w:t>Prerequisites</w:t>
+      </w:r>
+    </w:p>
+    <w:p>
+      <w:r>
+        <w:rPr>
+          <w:i/>
+          <w:iCs/>
+        </w:rPr>
         <w:t>None.</w:t>
       </w:r>
     </w:p>
@@ -789,9 +940,11 @@
       </w:r>
     </w:p>
     <w:p>
+      <w:proofErr w:type="spellStart"/>
       <w:r>
         <w:t>CGScholar</w:t>
       </w:r>
+      <w:proofErr w:type="spellEnd"/>
       <w:r>
         <w:t xml:space="preserve"> </w:t>
       </w:r>
@@ -802,7 +955,10 @@
         <w:t xml:space="preserve"> readings, announcements, Zoom links, seminar recordings, and grades</w:t>
       </w:r>
       <w:r>
-        <w:t>. C</w:t>
+        <w:t xml:space="preserve">. </w:t>
+      </w:r>
+      <w:r>
+        <w:t>Please c</w:t>
       </w:r>
       <w:r>
         <w:t xml:space="preserve">heck it </w:t>
@@ -811,10 +967,16 @@
         <w:t>regularly</w:t>
       </w:r>
       <w:r>
-        <w:t>. The running record of your own responses is kept in a Google Doc that you maintain across the whole term.</w:t>
-      </w:r>
-      <w:r>
-        <w:t xml:space="preserve"> Note that the Google Doc is shared, to facilitate peer review – if you’d rather keep it private please let me know.</w:t>
+        <w:t xml:space="preserve">. The running record of your own responses is kept in a Google Doc </w:t>
+      </w:r>
+      <w:r>
+        <w:t xml:space="preserve">(or a Word document if you prefer) </w:t>
+      </w:r>
+      <w:r>
+        <w:t>that you maintain across the whole term.</w:t>
+      </w:r>
+      <w:r>
+        <w:t xml:space="preserve"> </w:t>
       </w:r>
     </w:p>
     <w:p>
@@ -836,13 +998,42 @@
         <w:t>one</w:t>
       </w:r>
       <w:r>
-        <w:t xml:space="preserve"> book below should be obtained. All other readings — journal articles, machine learning papers, and excerpts — are provided through </w:t>
-      </w:r>
+        <w:t xml:space="preserve"> book below </w:t>
+      </w:r>
+      <w:r>
+        <w:t>will</w:t>
+      </w:r>
+      <w:r>
+        <w:t xml:space="preserve"> be </w:t>
+      </w:r>
+      <w:r>
+        <w:t>helpful</w:t>
+      </w:r>
+      <w:r>
+        <w:t xml:space="preserve"> to purchase</w:t>
+      </w:r>
+      <w:r>
+        <w:t>. All other readings</w:t>
+      </w:r>
+      <w:r>
+        <w:t>, including</w:t>
+      </w:r>
+      <w:r>
+        <w:t xml:space="preserve"> journal articles, machine learning papers, and excerpts</w:t>
+      </w:r>
+      <w:r>
+        <w:t>,</w:t>
+      </w:r>
+      <w:r>
+        <w:t xml:space="preserve"> are provided through </w:t>
+      </w:r>
+      <w:proofErr w:type="spellStart"/>
       <w:r>
         <w:t>CGScholar</w:t>
       </w:r>
-      <w:r>
-        <w:t>. A full reading list by week is maintained on the course website.</w:t>
+      <w:proofErr w:type="spellEnd"/>
+      <w:r>
+        <w:t xml:space="preserve">. </w:t>
       </w:r>
     </w:p>
     <w:p>
@@ -874,7 +1065,7 @@
         </w:rPr>
         <w:t xml:space="preserve">Online (and bilingual) version: </w:t>
       </w:r>
-      <w:hyperlink r:id="rId11" w:history="1">
+      <w:hyperlink r:id="rId12" w:history="1">
         <w:r>
           <w:rPr>
             <w:rStyle w:val="Hyperlink"/>
@@ -919,8 +1110,177 @@
           <w:sz w:val="22"/>
           <w:szCs w:val="22"/>
         </w:rPr>
-        <w:t>Because the seminar meets online, you will need a reliable internet connection and a device with a working microphone; a camera is welcome but not required. You will need Google Docs for the running record of your responses, and access to at least one contemporary generative AI system, since a weekly chat session forms part of the assessed cycle. Free tiers are sufficient. If cost or access is a barrier, tell me early and we will arrange an alternative; no student should be disadvantaged by this requirement.</w:t>
-      </w:r>
+        <w:t>Because the seminar meets online, you will need a reliable internet connection and a device with a working microphone; a camera is welcome but not required. You will need Google Docs</w:t>
+      </w:r>
+      <w:r>
+        <w:rPr>
+          <w:rFonts w:eastAsia="Arial" w:cs="Arial"/>
+          <w:sz w:val="22"/>
+          <w:szCs w:val="22"/>
+        </w:rPr>
+        <w:t xml:space="preserve"> or Microsoft Word</w:t>
+      </w:r>
+      <w:r>
+        <w:rPr>
+          <w:rFonts w:eastAsia="Arial" w:cs="Arial"/>
+          <w:sz w:val="22"/>
+          <w:szCs w:val="22"/>
+        </w:rPr>
+        <w:t xml:space="preserve"> for the running record of your responses, and access to at least one contemporary generative AI system, since a weekly chat session forms part of the assessed cycle. Free tiers are sufficient. If cost or access is a barrier, tell me early and we will arrange an alternative; no student should be disadvantaged by this requirement.</w:t>
+      </w:r>
+    </w:p>
+    <w:p>
+      <w:pPr>
+        <w:rPr>
+          <w:rFonts w:eastAsia="Arial" w:cs="Arial"/>
+          <w:sz w:val="22"/>
+          <w:szCs w:val="22"/>
+        </w:rPr>
+      </w:pPr>
+      <w:r>
+        <w:rPr>
+          <w:rFonts w:eastAsia="Arial" w:cs="Arial"/>
+          <w:sz w:val="22"/>
+          <w:szCs w:val="22"/>
+        </w:rPr>
+        <w:t xml:space="preserve">For more information on UIUC options for using AI, visit </w:t>
+      </w:r>
+      <w:hyperlink r:id="rId13" w:history="1">
+        <w:r>
+          <w:rPr>
+            <w:rStyle w:val="Hyperlink"/>
+            <w:rFonts w:eastAsia="Arial" w:cs="Arial"/>
+            <w:sz w:val="22"/>
+            <w:szCs w:val="22"/>
+          </w:rPr>
+          <w:t>https://genai.illinois.edu/</w:t>
+        </w:r>
+      </w:hyperlink>
+      <w:r>
+        <w:rPr>
+          <w:rFonts w:eastAsia="Arial" w:cs="Arial"/>
+          <w:sz w:val="22"/>
+          <w:szCs w:val="22"/>
+        </w:rPr>
+        <w:t xml:space="preserve"> . There are several options:</w:t>
+      </w:r>
+    </w:p>
+    <w:p>
+      <w:pPr>
+        <w:rPr>
+          <w:rFonts w:eastAsia="Arial" w:cs="Arial"/>
+          <w:sz w:val="22"/>
+          <w:szCs w:val="22"/>
+        </w:rPr>
+      </w:pPr>
+      <w:r>
+        <w:rPr>
+          <w:rFonts w:eastAsia="Arial" w:cs="Arial"/>
+          <w:sz w:val="22"/>
+          <w:szCs w:val="22"/>
+        </w:rPr>
+        <w:t xml:space="preserve">Microsoft Copilot: </w:t>
+      </w:r>
+      <w:hyperlink r:id="rId14" w:history="1">
+        <w:r>
+          <w:rPr>
+            <w:rStyle w:val="Hyperlink"/>
+            <w:rFonts w:eastAsia="Arial" w:cs="Arial"/>
+            <w:sz w:val="22"/>
+            <w:szCs w:val="22"/>
+          </w:rPr>
+          <w:t>https://genai.illinois.edu/ai-apps-copilot-chat/</w:t>
+        </w:r>
+      </w:hyperlink>
+      <w:r>
+        <w:rPr>
+          <w:rFonts w:eastAsia="Arial" w:cs="Arial"/>
+          <w:sz w:val="22"/>
+          <w:szCs w:val="22"/>
+        </w:rPr>
+        <w:t xml:space="preserve"> </w:t>
+      </w:r>
+    </w:p>
+    <w:p>
+      <w:pPr>
+        <w:rPr>
+          <w:rFonts w:eastAsia="Arial" w:cs="Arial"/>
+          <w:sz w:val="22"/>
+          <w:szCs w:val="22"/>
+        </w:rPr>
+      </w:pPr>
+      <w:r>
+        <w:rPr>
+          <w:rFonts w:eastAsia="Arial" w:cs="Arial"/>
+          <w:sz w:val="22"/>
+          <w:szCs w:val="22"/>
+        </w:rPr>
+        <w:t xml:space="preserve">Google Gemini: </w:t>
+      </w:r>
+      <w:hyperlink r:id="rId15" w:history="1">
+        <w:r>
+          <w:rPr>
+            <w:rStyle w:val="Hyperlink"/>
+            <w:rFonts w:eastAsia="Arial" w:cs="Arial"/>
+            <w:sz w:val="22"/>
+            <w:szCs w:val="22"/>
+          </w:rPr>
+          <w:t>https://genai.illinois.edu/ai-apps-google-gemini/</w:t>
+        </w:r>
+      </w:hyperlink>
+      <w:r>
+        <w:rPr>
+          <w:rFonts w:eastAsia="Arial" w:cs="Arial"/>
+          <w:sz w:val="22"/>
+          <w:szCs w:val="22"/>
+        </w:rPr>
+        <w:t xml:space="preserve"> </w:t>
+      </w:r>
+    </w:p>
+    <w:p>
+      <w:pPr>
+        <w:rPr>
+          <w:rFonts w:eastAsia="Arial" w:cs="Arial"/>
+          <w:sz w:val="22"/>
+          <w:szCs w:val="22"/>
+        </w:rPr>
+      </w:pPr>
+      <w:r>
+        <w:rPr>
+          <w:rFonts w:eastAsia="Arial" w:cs="Arial"/>
+          <w:sz w:val="22"/>
+          <w:szCs w:val="22"/>
+        </w:rPr>
+        <w:t xml:space="preserve">Illinois Chat: </w:t>
+      </w:r>
+      <w:hyperlink r:id="rId16" w:history="1">
+        <w:r>
+          <w:rPr>
+            <w:rStyle w:val="Hyperlink"/>
+            <w:rFonts w:eastAsia="Arial" w:cs="Arial"/>
+            <w:sz w:val="22"/>
+            <w:szCs w:val="22"/>
+          </w:rPr>
+          <w:t>https://www.ncsa.illinois.edu/research/project-highlights/illinois-chat/</w:t>
+        </w:r>
+      </w:hyperlink>
+      <w:r>
+        <w:rPr>
+          <w:rFonts w:eastAsia="Arial" w:cs="Arial"/>
+          <w:sz w:val="22"/>
+          <w:szCs w:val="22"/>
+        </w:rPr>
+        <w:t xml:space="preserve"> </w:t>
+      </w:r>
+    </w:p>
+    <w:p>
+      <w:pPr>
+        <w:rPr>
+          <w:rFonts w:eastAsia="Arial" w:cs="Arial"/>
+          <w:sz w:val="22"/>
+          <w:szCs w:val="22"/>
+        </w:rPr>
+      </w:pPr>
     </w:p>
     <w:p>
       <w:pPr>
@@ -1023,7 +1383,7 @@
                 <w:bCs/>
                 <w:color w:val="FFFFFF" w:themeColor="background1"/>
               </w:rPr>
-              <w:t>Point Value</w:t>
+              <w:t>Each Item</w:t>
             </w:r>
           </w:p>
         </w:tc>
@@ -1047,7 +1407,7 @@
                 <w:bCs/>
                 <w:color w:val="FFFFFF" w:themeColor="background1"/>
               </w:rPr>
-              <w:t>Total Points</w:t>
+              <w:t xml:space="preserve">Total </w:t>
             </w:r>
           </w:p>
         </w:tc>
@@ -1062,7 +1422,7 @@
               <w:pStyle w:val="TableParagraph"/>
             </w:pPr>
             <w:r>
-              <w:t>Formative self-assessment (Sessions 2–7)</w:t>
+              <w:t>Formative self-assessment (Sessions 2–6)</w:t>
             </w:r>
             <w:r>
               <w:t xml:space="preserve"> </w:t>
@@ -1090,7 +1450,7 @@
               <w:rPr>
                 <w:rFonts w:eastAsia="Arial" w:cs="Arial"/>
               </w:rPr>
-              <w:t>6</w:t>
+              <w:t>5</w:t>
             </w:r>
           </w:p>
         </w:tc>
@@ -1109,7 +1469,13 @@
               <w:rPr>
                 <w:rFonts w:eastAsia="Arial" w:cs="Arial"/>
               </w:rPr>
-              <w:t>100</w:t>
+              <w:t>10</w:t>
+            </w:r>
+            <w:r>
+              <w:rPr>
+                <w:rFonts w:eastAsia="Arial" w:cs="Arial"/>
+              </w:rPr>
+              <w:t>%</w:t>
             </w:r>
           </w:p>
         </w:tc>
@@ -1128,7 +1494,19 @@
               <w:rPr>
                 <w:rFonts w:eastAsia="Arial" w:cs="Arial"/>
               </w:rPr>
-              <w:t>600</w:t>
+              <w:t>5</w:t>
+            </w:r>
+            <w:r>
+              <w:rPr>
+                <w:rFonts w:eastAsia="Arial" w:cs="Arial"/>
+              </w:rPr>
+              <w:t>0</w:t>
+            </w:r>
+            <w:r>
+              <w:rPr>
+                <w:rFonts w:eastAsia="Arial" w:cs="Arial"/>
+              </w:rPr>
+              <w:t>%</w:t>
             </w:r>
           </w:p>
         </w:tc>
@@ -1143,7 +1521,7 @@
               <w:pStyle w:val="TableParagraph"/>
             </w:pPr>
             <w:r>
-              <w:t>Peer commentary (Sessions 3/4 and 6/7)</w:t>
+              <w:t>Peer commentary (Sessions 3 and 6)</w:t>
             </w:r>
             <w:r>
               <w:rPr>
@@ -1155,6 +1533,7 @@
               <w:rPr>
                 <w:vertAlign w:val="superscript"/>
               </w:rPr>
+              <w:lastRenderedPageBreak/>
               <w:t>2</w:t>
             </w:r>
           </w:p>
@@ -1174,6 +1553,7 @@
               <w:rPr>
                 <w:rFonts w:eastAsia="Arial" w:cs="Arial"/>
               </w:rPr>
+              <w:lastRenderedPageBreak/>
               <w:t>2</w:t>
             </w:r>
           </w:p>
@@ -1193,7 +1573,13 @@
               <w:rPr>
                 <w:rFonts w:eastAsia="Arial" w:cs="Arial"/>
               </w:rPr>
-              <w:t>50</w:t>
+              <w:t>5</w:t>
+            </w:r>
+            <w:r>
+              <w:rPr>
+                <w:rFonts w:eastAsia="Arial" w:cs="Arial"/>
+              </w:rPr>
+              <w:t>%</w:t>
             </w:r>
           </w:p>
         </w:tc>
@@ -1212,7 +1598,13 @@
               <w:rPr>
                 <w:rFonts w:eastAsia="Arial" w:cs="Arial"/>
               </w:rPr>
-              <w:t>100</w:t>
+              <w:t>10</w:t>
+            </w:r>
+            <w:r>
+              <w:rPr>
+                <w:rFonts w:eastAsia="Arial" w:cs="Arial"/>
+              </w:rPr>
+              <w:t>%</w:t>
             </w:r>
           </w:p>
         </w:tc>
@@ -1274,7 +1666,19 @@
               <w:rPr>
                 <w:rFonts w:eastAsia="Arial" w:cs="Arial"/>
               </w:rPr>
-              <w:t>300</w:t>
+              <w:t>4</w:t>
+            </w:r>
+            <w:r>
+              <w:rPr>
+                <w:rFonts w:eastAsia="Arial" w:cs="Arial"/>
+              </w:rPr>
+              <w:t>0</w:t>
+            </w:r>
+            <w:r>
+              <w:rPr>
+                <w:rFonts w:eastAsia="Arial" w:cs="Arial"/>
+              </w:rPr>
+              <w:t>%</w:t>
             </w:r>
           </w:p>
         </w:tc>
@@ -1293,7 +1697,19 @@
               <w:rPr>
                 <w:rFonts w:eastAsia="Arial" w:cs="Arial"/>
               </w:rPr>
-              <w:t>300</w:t>
+              <w:t>4</w:t>
+            </w:r>
+            <w:r>
+              <w:rPr>
+                <w:rFonts w:eastAsia="Arial" w:cs="Arial"/>
+              </w:rPr>
+              <w:t>0</w:t>
+            </w:r>
+            <w:r>
+              <w:rPr>
+                <w:rFonts w:eastAsia="Arial" w:cs="Arial"/>
+              </w:rPr>
+              <w:t>%</w:t>
             </w:r>
           </w:p>
         </w:tc>
@@ -1365,7 +1781,13 @@
               <w:rPr>
                 <w:rFonts w:eastAsia="Arial" w:cs="Arial"/>
               </w:rPr>
-              <w:t>1000</w:t>
+              <w:t>100</w:t>
+            </w:r>
+            <w:r>
+              <w:rPr>
+                <w:rFonts w:eastAsia="Arial" w:cs="Arial"/>
+              </w:rPr>
+              <w:t>%</w:t>
             </w:r>
           </w:p>
         </w:tc>
@@ -1376,7 +1798,6 @@
         <w:pStyle w:val="Heading3"/>
       </w:pPr>
       <w:r>
-        <w:lastRenderedPageBreak/>
         <w:t>Grading Criteria</w:t>
       </w:r>
     </w:p>
@@ -1395,7 +1816,7 @@
         <w:rPr>
           <w:rFonts w:eastAsia="Arial" w:cs="Arial"/>
         </w:rPr>
-        <w:t>Much</w:t>
+        <w:t>Half</w:t>
       </w:r>
       <w:r>
         <w:rPr>
@@ -1427,7 +1848,69 @@
         <w:rPr>
           <w:rFonts w:eastAsia="Arial" w:cs="Arial"/>
         </w:rPr>
-        <w:t xml:space="preserve">. What did you know last week, what do you know now, and how would you grade that rate of change? This is subjective, and there are two arguments for it anyway. The first is Hegelian, and this is a Hegel course: I can only judge the facade of your learning, its outward appearance, whereas only you know whether you have learned something — aligning the assessment of the course with its content is itself a Hegelian move. The second is that in an age of AI we want learning to become more accountable, not less. I reserve the right to upgrade marks that strike me as excessively punitive, and I will give you my own written commentary at two points during the term. </w:t>
+        <w:t xml:space="preserve">. What did you know last week, what do you know now, and how would you grade that rate of change? </w:t>
+      </w:r>
+      <w:r>
+        <w:rPr>
+          <w:rFonts w:eastAsia="Arial" w:cs="Arial"/>
+        </w:rPr>
+        <w:br/>
+      </w:r>
+      <w:r>
+        <w:rPr>
+          <w:rFonts w:eastAsia="Arial" w:cs="Arial"/>
+        </w:rPr>
+        <w:br/>
+      </w:r>
+      <w:r>
+        <w:rPr>
+          <w:rFonts w:eastAsia="Arial" w:cs="Arial"/>
+          <w:i/>
+          <w:iCs/>
+        </w:rPr>
+        <w:t>Why self-assessed</w:t>
+      </w:r>
+      <w:r>
+        <w:rPr>
+          <w:rFonts w:eastAsia="Arial" w:cs="Arial"/>
+        </w:rPr>
+        <w:t xml:space="preserve">? The course is designed to ask you to reflect, by way of concepts and readings, on your own stance toward machine learning and human learning. What matters here is the sense of change you might have week-to-week as you move through these concepts. This doesn’t mean you need to change your perspective, only that you incorporate and reflect upon the weekly concepts as part of how you articulate that perspective. This is something only you can judge – and self-assessment here is intimately connected with the course’s (and Hegel’s) themes of self-consciousness. </w:t>
+      </w:r>
+      <w:r>
+        <w:rPr>
+          <w:rFonts w:eastAsia="Arial" w:cs="Arial"/>
+        </w:rPr>
+        <w:br/>
+      </w:r>
+      <w:r>
+        <w:rPr>
+          <w:rFonts w:eastAsia="Arial" w:cs="Arial"/>
+        </w:rPr>
+        <w:br/>
+      </w:r>
+      <w:r>
+        <w:rPr>
+          <w:rFonts w:eastAsia="Arial" w:cs="Arial"/>
+        </w:rPr>
+        <w:t xml:space="preserve">I </w:t>
+      </w:r>
+      <w:r>
+        <w:rPr>
+          <w:rFonts w:eastAsia="Arial" w:cs="Arial"/>
+        </w:rPr>
+        <w:t xml:space="preserve">will </w:t>
+      </w:r>
+      <w:r>
+        <w:rPr>
+          <w:rFonts w:eastAsia="Arial" w:cs="Arial"/>
+        </w:rPr>
+        <w:t xml:space="preserve">reserve the right to upgrade marks that strike me as excessively punitive, and I will give you my own written commentary at two points during the term. </w:t>
+      </w:r>
+      <w:r>
+        <w:rPr>
+          <w:rFonts w:eastAsia="Arial" w:cs="Arial"/>
+        </w:rPr>
+        <w:br/>
       </w:r>
     </w:p>
     <w:p>
@@ -1453,6 +1936,63 @@
         </w:rPr>
         <w:t xml:space="preserve"> These will be graded as just PASS (done) / FAIL (not done).</w:t>
       </w:r>
+      <w:r>
+        <w:rPr>
+          <w:rFonts w:eastAsia="Arial" w:cs="Arial"/>
+        </w:rPr>
+        <w:br/>
+      </w:r>
+      <w:r>
+        <w:rPr>
+          <w:rFonts w:eastAsia="Arial" w:cs="Arial"/>
+        </w:rPr>
+        <w:br/>
+        <w:t>For privacy reasons, d</w:t>
+      </w:r>
+      <w:r>
+        <w:rPr>
+          <w:rFonts w:eastAsia="Arial" w:cs="Arial"/>
+        </w:rPr>
+        <w:t xml:space="preserve">o </w:t>
+      </w:r>
+      <w:r>
+        <w:rPr>
+          <w:rFonts w:eastAsia="Arial" w:cs="Arial"/>
+          <w:b/>
+          <w:bCs/>
+        </w:rPr>
+        <w:t>not</w:t>
+      </w:r>
+      <w:r>
+        <w:rPr>
+          <w:rFonts w:eastAsia="Arial" w:cs="Arial"/>
+        </w:rPr>
+        <w:t xml:space="preserve"> use AI to assist or support</w:t>
+      </w:r>
+      <w:r>
+        <w:rPr>
+          <w:rFonts w:eastAsia="Arial" w:cs="Arial"/>
+        </w:rPr>
+        <w:t xml:space="preserve"> a classmate's work</w:t>
+      </w:r>
+      <w:r>
+        <w:rPr>
+          <w:rFonts w:eastAsia="Arial" w:cs="Arial"/>
+        </w:rPr>
+        <w:t>. Only</w:t>
+      </w:r>
+      <w:r>
+        <w:rPr>
+          <w:rFonts w:eastAsia="Arial" w:cs="Arial"/>
+        </w:rPr>
+        <w:t xml:space="preserve"> comment on it yourself.</w:t>
+      </w:r>
+      <w:r>
+        <w:rPr>
+          <w:rFonts w:eastAsia="Arial" w:cs="Arial"/>
+        </w:rPr>
+        <w:br/>
+      </w:r>
     </w:p>
     <w:p>
       <w:pPr>
@@ -1565,7 +2105,20 @@
         <w:rPr>
           <w:rFonts w:eastAsia="Arial" w:cs="Arial"/>
         </w:rPr>
-        <w:t>For example you might choose to develop a new training regime for machine learning algorithms; a curriculum for high school students to learn how to use AI responsibly; an essay outlining the dire consequences of machine learning let loose in today’s schools; a policy that endorses, with appropriate guardrails, use of AI in a workplace</w:t>
+        <w:br/>
+      </w:r>
+      <w:r>
+        <w:rPr>
+          <w:rFonts w:eastAsia="Arial" w:cs="Arial"/>
+        </w:rPr>
+        <w:t xml:space="preserve">For example you might choose to develop a new training regime for machine learning algorithms; a curriculum for high school students to learn how to use AI responsibly; an essay outlining the dire consequences of machine learning let loose in today’s schools; a policy that endorses, with appropriate guardrails, use </w:t>
+      </w:r>
+      <w:r>
+        <w:rPr>
+          <w:rFonts w:eastAsia="Arial" w:cs="Arial"/>
+        </w:rPr>
+        <w:lastRenderedPageBreak/>
+        <w:t>of AI in a workplace</w:t>
       </w:r>
       <w:r>
         <w:rPr>
@@ -1609,7 +2162,19 @@
         <w:rPr>
           <w:rFonts w:eastAsia="Arial" w:cs="Arial"/>
         </w:rPr>
-        <w:t xml:space="preserve">. </w:t>
+        <w:t>.</w:t>
+      </w:r>
+      <w:r>
+        <w:rPr>
+          <w:rFonts w:eastAsia="Arial" w:cs="Arial"/>
+        </w:rPr>
+        <w:t xml:space="preserve"> As noted below, the writing should make use of three of the concepts in the course, and at least three of the readings.</w:t>
+      </w:r>
+      <w:r>
+        <w:rPr>
+          <w:rFonts w:eastAsia="Arial" w:cs="Arial"/>
+        </w:rPr>
+        <w:t xml:space="preserve"> </w:t>
       </w:r>
       <w:r>
         <w:rPr>
@@ -1743,7 +2308,21 @@
         <w:rPr>
           <w:rFonts w:eastAsia="Arial" w:cs="Arial"/>
         </w:rPr>
-        <w:t xml:space="preserve"> – even if indirect  – should be supplied to the question you’ve posed (ie. a curriculum is an answer to a question about what should be taught and how).</w:t>
+        <w:t xml:space="preserve"> – even if indirect – should be supplied to the question you’ve posed (</w:t>
+      </w:r>
+      <w:proofErr w:type="spellStart"/>
+      <w:r>
+        <w:rPr>
+          <w:rFonts w:eastAsia="Arial" w:cs="Arial"/>
+        </w:rPr>
+        <w:t>ie</w:t>
+      </w:r>
+      <w:proofErr w:type="spellEnd"/>
+      <w:r>
+        <w:rPr>
+          <w:rFonts w:eastAsia="Arial" w:cs="Arial"/>
+        </w:rPr>
+        <w:t>. a curriculum is an answer to a question about what should be taught and how).</w:t>
       </w:r>
     </w:p>
     <w:p>
@@ -1757,40 +2336,7 @@
         <w:rPr>
           <w:rFonts w:eastAsia="Arial" w:cs="Arial"/>
         </w:rPr>
-        <w:lastRenderedPageBreak/>
-        <w:t xml:space="preserve">e. At least three of the following </w:t>
-      </w:r>
-      <w:r>
-        <w:rPr>
-          <w:rFonts w:eastAsia="Arial" w:cs="Arial"/>
-        </w:rPr>
-        <w:t xml:space="preserve">course </w:t>
-      </w:r>
-      <w:r>
-        <w:rPr>
-          <w:rFonts w:eastAsia="Arial" w:cs="Arial"/>
-        </w:rPr>
-        <w:t>concepts should be included in some way: experience, recognition, attention, consciousness, alignment, critique, synthesis.</w:t>
-      </w:r>
-    </w:p>
-    <w:p>
-      <w:pPr>
-        <w:pStyle w:val="ListParagraph"/>
-        <w:rPr>
-          <w:rFonts w:eastAsia="Arial" w:cs="Arial"/>
-        </w:rPr>
-      </w:pPr>
-      <w:r>
-        <w:rPr>
-          <w:rFonts w:eastAsia="Arial" w:cs="Arial"/>
-        </w:rPr>
-        <w:t>f</w:t>
-      </w:r>
-      <w:r>
-        <w:rPr>
-          <w:rFonts w:eastAsia="Arial" w:cs="Arial"/>
-        </w:rPr>
-        <w:t xml:space="preserve">. References adhere to your preferred chosen standard (APA, Chicago etc). Regardless of genre, no less than </w:t>
+        <w:t xml:space="preserve">e. At least </w:t>
       </w:r>
       <w:r>
         <w:rPr>
@@ -1798,19 +2344,7 @@
           <w:b/>
           <w:bCs/>
         </w:rPr>
-        <w:t>six</w:t>
-      </w:r>
-      <w:r>
-        <w:rPr>
-          <w:rFonts w:eastAsia="Arial" w:cs="Arial"/>
-        </w:rPr>
-        <w:t xml:space="preserve"> references should be cited and listed in the bibliography.</w:t>
-      </w:r>
-      <w:r>
-        <w:rPr>
-          <w:rFonts w:eastAsia="Arial" w:cs="Arial"/>
-        </w:rPr>
-        <w:t xml:space="preserve"> </w:t>
+        <w:t xml:space="preserve">three of the following </w:t>
       </w:r>
       <w:r>
         <w:rPr>
@@ -1818,6 +2352,82 @@
           <w:b/>
           <w:bCs/>
         </w:rPr>
+        <w:t xml:space="preserve">course </w:t>
+      </w:r>
+      <w:r>
+        <w:rPr>
+          <w:rFonts w:eastAsia="Arial" w:cs="Arial"/>
+          <w:b/>
+          <w:bCs/>
+        </w:rPr>
+        <w:t>concepts</w:t>
+      </w:r>
+      <w:r>
+        <w:rPr>
+          <w:rFonts w:eastAsia="Arial" w:cs="Arial"/>
+        </w:rPr>
+        <w:t xml:space="preserve"> should be included in some way: experience, recognition, attention, consciousness, alignment, critique, synthesis.</w:t>
+      </w:r>
+    </w:p>
+    <w:p>
+      <w:pPr>
+        <w:pStyle w:val="ListParagraph"/>
+        <w:rPr>
+          <w:rFonts w:eastAsia="Arial" w:cs="Arial"/>
+        </w:rPr>
+      </w:pPr>
+      <w:r>
+        <w:rPr>
+          <w:rFonts w:eastAsia="Arial" w:cs="Arial"/>
+        </w:rPr>
+        <w:t>f</w:t>
+      </w:r>
+      <w:r>
+        <w:rPr>
+          <w:rFonts w:eastAsia="Arial" w:cs="Arial"/>
+        </w:rPr>
+        <w:t xml:space="preserve">. References adhere to your preferred chosen standard (APA, Chicago </w:t>
+      </w:r>
+      <w:proofErr w:type="spellStart"/>
+      <w:r>
+        <w:rPr>
+          <w:rFonts w:eastAsia="Arial" w:cs="Arial"/>
+        </w:rPr>
+        <w:t>etc</w:t>
+      </w:r>
+      <w:proofErr w:type="spellEnd"/>
+      <w:r>
+        <w:rPr>
+          <w:rFonts w:eastAsia="Arial" w:cs="Arial"/>
+        </w:rPr>
+        <w:t xml:space="preserve">). Regardless of genre, no less than </w:t>
+      </w:r>
+      <w:r>
+        <w:rPr>
+          <w:rFonts w:eastAsia="Arial" w:cs="Arial"/>
+          <w:b/>
+          <w:bCs/>
+        </w:rPr>
+        <w:t>six</w:t>
+      </w:r>
+      <w:r>
+        <w:rPr>
+          <w:rFonts w:eastAsia="Arial" w:cs="Arial"/>
+        </w:rPr>
+        <w:t xml:space="preserve"> references should be cited and listed in the bibliography.</w:t>
+      </w:r>
+      <w:r>
+        <w:rPr>
+          <w:rFonts w:eastAsia="Arial" w:cs="Arial"/>
+        </w:rPr>
+        <w:t xml:space="preserve"> </w:t>
+      </w:r>
+      <w:r>
+        <w:rPr>
+          <w:rFonts w:eastAsia="Arial" w:cs="Arial"/>
+          <w:b/>
+          <w:bCs/>
+        </w:rPr>
         <w:t>Three</w:t>
       </w:r>
       <w:r>
@@ -1841,6 +2451,82 @@
       </w:pPr>
       <w:r>
         <w:t>Course Components</w:t>
+      </w:r>
+    </w:p>
+    <w:p>
+      <w:pPr>
+        <w:rPr>
+          <w:spacing w:val="-3"/>
+        </w:rPr>
+      </w:pPr>
+      <w:r>
+        <w:rPr>
+          <w:spacing w:val="-3"/>
+        </w:rPr>
+        <w:t xml:space="preserve">In week 1, you will be asked to write some thoughts that synthesize your formal and informal learning experiences about both machine and human learning. This is not </w:t>
+      </w:r>
+      <w:proofErr w:type="gramStart"/>
+      <w:r>
+        <w:rPr>
+          <w:spacing w:val="-3"/>
+        </w:rPr>
+        <w:t>assessed, but</w:t>
+      </w:r>
+      <w:proofErr w:type="gramEnd"/>
+      <w:r>
+        <w:rPr>
+          <w:spacing w:val="-3"/>
+        </w:rPr>
+        <w:t xml:space="preserve"> does form the basis for the assessment that follows.</w:t>
+      </w:r>
+    </w:p>
+    <w:p>
+      <w:pPr>
+        <w:rPr>
+          <w:spacing w:val="-3"/>
+        </w:rPr>
+      </w:pPr>
+      <w:r>
+        <w:rPr>
+          <w:spacing w:val="-3"/>
+        </w:rPr>
+        <w:t xml:space="preserve">Think of the course as </w:t>
+      </w:r>
+      <w:r>
+        <w:rPr>
+          <w:spacing w:val="-3"/>
+        </w:rPr>
+        <w:t>five</w:t>
+      </w:r>
+      <w:r>
+        <w:rPr>
+          <w:spacing w:val="-3"/>
+        </w:rPr>
+        <w:t xml:space="preserve">-plus-one iterations on your own initial </w:t>
+      </w:r>
+      <w:r>
+        <w:rPr>
+          <w:spacing w:val="-3"/>
+        </w:rPr>
+        <w:t>reflections</w:t>
+      </w:r>
+      <w:r>
+        <w:rPr>
+          <w:spacing w:val="-3"/>
+        </w:rPr>
+        <w:t>, with a mix of self- and other-assessment. You begin by writing down what you already think; each week you revise it in the light of a new concept and grade your own contribution; twice you exchange commentary with a peer; and at the end you synthesize the whole sequence into a final report</w:t>
+      </w:r>
+      <w:r>
+        <w:rPr>
+          <w:spacing w:val="-3"/>
+        </w:rPr>
+        <w:t>, curriculum design or policy document</w:t>
+      </w:r>
+      <w:r>
+        <w:rPr>
+          <w:spacing w:val="-3"/>
+        </w:rPr>
+        <w:t xml:space="preserve">. </w:t>
       </w:r>
     </w:p>
     <w:p>
@@ -1856,19 +2542,35 @@
         <w:rPr>
           <w:spacing w:val="-3"/>
         </w:rPr>
-        <w:t>Think of the course as six-plus-one iterations on your own initial impulses, with a mix of self- and other-assessment. You begin by writing down what you already think; each week you revise it in the light of a new concept and grade your own contribution; twice you exchange commentary with a peer; and at the end you synthesize the whole sequence into a final report</w:t>
-      </w:r>
-      <w:r>
-        <w:rPr>
+        <w:t xml:space="preserve">Aside: why this structure? As we will see from Hegel’s </w:t>
+      </w:r>
+      <w:r>
+        <w:rPr>
+          <w:i/>
+          <w:iCs/>
           <w:spacing w:val="-3"/>
         </w:rPr>
-        <w:t>, curriculum design or policy document</w:t>
+        <w:t>Phenomenology</w:t>
       </w:r>
       <w:r>
         <w:rPr>
           <w:spacing w:val="-3"/>
         </w:rPr>
-        <w:t>. The record of the changes is the work, so all of it is kept in one Google Doc.</w:t>
+        <w:t xml:space="preserve">, his (and many later) account of learning is </w:t>
+      </w:r>
+      <w:r>
+        <w:rPr>
+          <w:i/>
+          <w:iCs/>
+          <w:spacing w:val="-3"/>
+        </w:rPr>
+        <w:t>dialectical</w:t>
+      </w:r>
+      <w:r>
+        <w:rPr>
+          <w:spacing w:val="-3"/>
+        </w:rPr>
+        <w:t>, moving from one concept to another in a way that affirms but also negates and extends where we started. The assessment seeks to mirror that process.</w:t>
       </w:r>
     </w:p>
     <w:p>
@@ -1905,12 +2607,24 @@
         <w:rPr>
           <w:spacing w:val="-5"/>
         </w:rPr>
-        <w:t xml:space="preserve">, write 200–300 words in your own words </w:t>
+        <w:t>, write 2</w:t>
       </w:r>
       <w:r>
         <w:rPr>
           <w:spacing w:val="-5"/>
         </w:rPr>
+        <w:t>5</w:t>
+      </w:r>
+      <w:r>
+        <w:rPr>
+          <w:spacing w:val="-5"/>
+        </w:rPr>
+        <w:t xml:space="preserve">0–300 words in your own words </w:t>
+      </w:r>
+      <w:r>
+        <w:rPr>
+          <w:spacing w:val="-5"/>
+        </w:rPr>
         <w:t>–</w:t>
       </w:r>
       <w:r>
@@ -1929,7 +2643,40 @@
         <w:rPr>
           <w:spacing w:val="-5"/>
         </w:rPr>
-        <w:t xml:space="preserve"> defining machine learning as you understand it today, then human learning; setting out the similarities, differences and relationship between the two, including how machine learning builds on human learning and how human learning may or may not benefit from it; and finally naming the most important question you want answered about AI in relation to learning, with your own provisional answer. This sounds like a survey, and in a way it is, but it sets a baseline of your understanding that the rest of the course revisits. </w:t>
+        <w:t xml:space="preserve"> defining machine learning as you understand it today, then human learning; setting out the similarities, differences and relationship between the two, including how machine learning builds on human learning and </w:t>
+      </w:r>
+      <w:r>
+        <w:rPr>
+          <w:spacing w:val="-5"/>
+        </w:rPr>
+        <w:lastRenderedPageBreak/>
+        <w:t xml:space="preserve">how human learning may or may not benefit from it; and finally naming the most important question you want answered about AI in relation to learning, with your own provisional answer. This sounds like a survey, and in a </w:t>
+      </w:r>
+      <w:proofErr w:type="gramStart"/>
+      <w:r>
+        <w:rPr>
+          <w:spacing w:val="-5"/>
+        </w:rPr>
+        <w:t>way</w:t>
+      </w:r>
+      <w:proofErr w:type="gramEnd"/>
+      <w:r>
+        <w:rPr>
+          <w:spacing w:val="-5"/>
+        </w:rPr>
+        <w:t xml:space="preserve"> it is</w:t>
+      </w:r>
+      <w:r>
+        <w:rPr>
+          <w:spacing w:val="-5"/>
+        </w:rPr>
+        <w:t xml:space="preserve"> – I will be making use of it to ensure future weeks are as relevant as possible –</w:t>
+      </w:r>
+      <w:r>
+        <w:rPr>
+          <w:spacing w:val="-5"/>
+        </w:rPr>
+        <w:t xml:space="preserve"> but it sets a baseline of your understanding that the rest of the course revisits. </w:t>
       </w:r>
       <w:r>
         <w:rPr>
@@ -2149,7 +2896,19 @@
               <w:rPr>
                 <w:rFonts w:eastAsia="Arial" w:cs="Arial"/>
               </w:rPr>
-              <w:t>200–500 words on how you define machine learning and human learning, their relationship, and the question you most want answered. Written in the first fortnight. Not graded.</w:t>
+              <w:t>2</w:t>
+            </w:r>
+            <w:r>
+              <w:rPr>
+                <w:rFonts w:eastAsia="Arial" w:cs="Arial"/>
+              </w:rPr>
+              <w:t>5</w:t>
+            </w:r>
+            <w:r>
+              <w:rPr>
+                <w:rFonts w:eastAsia="Arial" w:cs="Arial"/>
+              </w:rPr>
+              <w:t>0–500 words on how you define machine learning and human learning, their relationship, and the question you most want answered. Written in the first fortnight. Not graded.</w:t>
             </w:r>
           </w:p>
         </w:tc>
@@ -2180,6 +2939,12 @@
                 <w:rFonts w:eastAsia="Arial" w:cs="Arial"/>
               </w:rPr>
               <w:t>0</w:t>
+            </w:r>
+            <w:r>
+              <w:rPr>
+                <w:rFonts w:eastAsia="Arial" w:cs="Arial"/>
+              </w:rPr>
+              <w:t xml:space="preserve"> (0%)</w:t>
             </w:r>
           </w:p>
         </w:tc>
@@ -2216,7 +2981,7 @@
                 <w:b/>
                 <w:bCs/>
               </w:rPr>
-              <w:t>Formative self-assessment (× 6)</w:t>
+              <w:t>Formative self-assessment (× 5)</w:t>
             </w:r>
           </w:p>
         </w:tc>
@@ -2246,14 +3011,49 @@
               <w:rPr>
                 <w:rFonts w:eastAsia="Arial" w:cs="Arial"/>
               </w:rPr>
-              <w:t xml:space="preserve">One cycle per concept, Sessions 2–7: notes from the readings, lecture and discussion; a chat session with your preferred AI system; a copy-then-revise pass over your previous responses; peer review in </w:t>
+              <w:t>One cycle per concept, Sessions 2–6: notes from the readings, lecture and discussion; a chat session with your preferred AI system; a copy-then-revise pass over your previous responses; peer review in class; and a short reflective note in which you grade your own contribution.</w:t>
             </w:r>
             <w:r>
               <w:rPr>
                 <w:rFonts w:eastAsia="Arial" w:cs="Arial"/>
               </w:rPr>
-              <w:lastRenderedPageBreak/>
-              <w:t>class; and a short reflective note in which you grade your own contribution.</w:t>
+              <w:t xml:space="preserve"> Expect </w:t>
+            </w:r>
+            <w:r>
+              <w:rPr>
+                <w:rFonts w:eastAsia="Arial" w:cs="Arial"/>
+              </w:rPr>
+              <w:t>to write a minimum of</w:t>
+            </w:r>
+            <w:r>
+              <w:rPr>
+                <w:rFonts w:eastAsia="Arial" w:cs="Arial"/>
+              </w:rPr>
+              <w:t xml:space="preserve"> 2</w:t>
+            </w:r>
+            <w:r>
+              <w:rPr>
+                <w:rFonts w:eastAsia="Arial" w:cs="Arial"/>
+              </w:rPr>
+              <w:t>5</w:t>
+            </w:r>
+            <w:r>
+              <w:rPr>
+                <w:rFonts w:eastAsia="Arial" w:cs="Arial"/>
+              </w:rPr>
+              <w:t xml:space="preserve">0 words </w:t>
+            </w:r>
+            <w:r>
+              <w:rPr>
+                <w:rFonts w:eastAsia="Arial" w:cs="Arial"/>
+              </w:rPr>
+              <w:t>per week</w:t>
+            </w:r>
+            <w:r>
+              <w:rPr>
+                <w:rFonts w:eastAsia="Arial" w:cs="Arial"/>
+              </w:rPr>
+              <w:t>.</w:t>
             </w:r>
           </w:p>
         </w:tc>
@@ -2283,8 +3083,31 @@
               <w:rPr>
                 <w:rFonts w:eastAsia="Arial" w:cs="Arial"/>
               </w:rPr>
-              <w:lastRenderedPageBreak/>
-              <w:t>100 each (600)</w:t>
+              <w:t>1</w:t>
+            </w:r>
+            <w:r>
+              <w:rPr>
+                <w:rFonts w:eastAsia="Arial" w:cs="Arial"/>
+              </w:rPr>
+              <w:t>0</w:t>
+            </w:r>
+            <w:r>
+              <w:rPr>
+                <w:rFonts w:eastAsia="Arial" w:cs="Arial"/>
+              </w:rPr>
+              <w:t>%</w:t>
+            </w:r>
+            <w:r>
+              <w:rPr>
+                <w:rFonts w:eastAsia="Arial" w:cs="Arial"/>
+              </w:rPr>
+              <w:t xml:space="preserve"> each </w:t>
+            </w:r>
+            <w:r>
+              <w:rPr>
+                <w:rFonts w:eastAsia="Arial" w:cs="Arial"/>
+              </w:rPr>
+              <w:t>(50%)</w:t>
             </w:r>
           </w:p>
         </w:tc>
@@ -2351,7 +3174,7 @@
               <w:rPr>
                 <w:rFonts w:eastAsia="Arial" w:cs="Arial"/>
               </w:rPr>
-              <w:t>Read and comment on a peer’s revised responses, once across Sessions 3/4 and again across Sessions 6/7. A hurdle requirement: awarded on completion in good faith, not graded on quality.</w:t>
+              <w:t>Read and comment on a peer’s revised responses, three comments in Session 3 and three more in Session 6. A hurdle requirement: awarded on completion in good faith, not graded on quality.</w:t>
             </w:r>
           </w:p>
         </w:tc>
@@ -2381,7 +3204,25 @@
               <w:rPr>
                 <w:rFonts w:eastAsia="Arial" w:cs="Arial"/>
               </w:rPr>
-              <w:t>50 each (100)</w:t>
+              <w:t>5</w:t>
+            </w:r>
+            <w:r>
+              <w:rPr>
+                <w:rFonts w:eastAsia="Arial" w:cs="Arial"/>
+              </w:rPr>
+              <w:t>%</w:t>
+            </w:r>
+            <w:r>
+              <w:rPr>
+                <w:rFonts w:eastAsia="Arial" w:cs="Arial"/>
+              </w:rPr>
+              <w:t xml:space="preserve"> each </w:t>
+            </w:r>
+            <w:r>
+              <w:rPr>
+                <w:rFonts w:eastAsia="Arial" w:cs="Arial"/>
+              </w:rPr>
+              <w:t>(10%)</w:t>
             </w:r>
           </w:p>
         </w:tc>
@@ -2448,7 +3289,14 @@
               <w:rPr>
                 <w:rFonts w:eastAsia="Arial" w:cs="Arial"/>
               </w:rPr>
-              <w:t>A summative report, essay, or curriculum design synthesizing the course materials and building directly on the six formative iterations. Its exact form is settled together during the term. Due Fri 16 Oct.</w:t>
+              <w:t xml:space="preserve">A summative report, essay, or curriculum design synthesizing the course materials and building directly on the five </w:t>
+            </w:r>
+            <w:r>
+              <w:rPr>
+                <w:rFonts w:eastAsia="Arial" w:cs="Arial"/>
+              </w:rPr>
+              <w:lastRenderedPageBreak/>
+              <w:t>formative iterations. Its exact form is settled together during the term. Due Fri 16 Oct.</w:t>
             </w:r>
           </w:p>
         </w:tc>
@@ -2478,7 +3326,8 @@
               <w:rPr>
                 <w:rFonts w:eastAsia="Arial" w:cs="Arial"/>
               </w:rPr>
-              <w:t>300</w:t>
+              <w:lastRenderedPageBreak/>
+              <w:t>40%</w:t>
             </w:r>
           </w:p>
         </w:tc>
@@ -2540,20 +3389,40 @@
         <w:rPr>
           <w:spacing w:val="-5"/>
         </w:rPr>
-        <w:t>Hour 2: Open Lecture (in the sense that you can interrupt, pose questions etc)</w:t>
-      </w:r>
-    </w:p>
-    <w:p>
-      <w:pPr>
+        <w:t xml:space="preserve">Hour 2: Open Lecture (in the sense that you can interrupt, pose questions </w:t>
+      </w:r>
+      <w:proofErr w:type="spellStart"/>
+      <w:r>
         <w:rPr>
           <w:spacing w:val="-5"/>
         </w:rPr>
-      </w:pPr>
+        <w:t>etc</w:t>
+      </w:r>
+      <w:proofErr w:type="spellEnd"/>
       <w:r>
         <w:rPr>
           <w:spacing w:val="-5"/>
         </w:rPr>
+        <w:t>)</w:t>
+      </w:r>
+    </w:p>
+    <w:p>
+      <w:pPr>
+        <w:rPr>
+          <w:spacing w:val="-5"/>
+        </w:rPr>
+      </w:pPr>
+      <w:r>
+        <w:rPr>
+          <w:spacing w:val="-5"/>
+        </w:rPr>
         <w:t>Hour 3: Small group discussions, work on weekly activities</w:t>
+      </w:r>
+      <w:r>
+        <w:rPr>
+          <w:spacing w:val="-5"/>
+        </w:rPr>
+        <w:t>, including AI chat sessions</w:t>
       </w:r>
     </w:p>
     <w:p>
@@ -2613,30 +3482,92 @@
         <w:rPr>
           <w:spacing w:val="-5"/>
         </w:rPr>
-        <w:t xml:space="preserve">A summative piece that synthesizes the course materials — a report, an essay, or a curriculum design. It builds directly on the formative work: the six iterations are the raw material and this is the seventh. </w:t>
+        <w:t xml:space="preserve">A summative piece that synthesizes the course materials </w:t>
       </w:r>
       <w:r>
         <w:rPr>
           <w:spacing w:val="-5"/>
         </w:rPr>
+        <w:t>–</w:t>
+      </w:r>
+      <w:r>
+        <w:rPr>
+          <w:spacing w:val="-5"/>
+        </w:rPr>
+        <w:t xml:space="preserve"> a report, an essay, or a curriculum design. It builds directly on the formative work: the five iterations are the raw material </w:t>
+      </w:r>
+      <w:r>
+        <w:rPr>
+          <w:spacing w:val="-5"/>
+        </w:rPr>
+        <w:t>which you can incorporate, summarize, revise and extend</w:t>
+      </w:r>
+      <w:r>
+        <w:rPr>
+          <w:spacing w:val="-5"/>
+        </w:rPr>
+        <w:t xml:space="preserve">. </w:t>
+      </w:r>
+      <w:r>
+        <w:rPr>
+          <w:spacing w:val="-5"/>
+        </w:rPr>
+        <w:t xml:space="preserve">Note that the cumulative self-assessed responses to weeks 2–6 will need some re-shaping into your chosen genre for this </w:t>
+      </w:r>
+      <w:proofErr w:type="gramStart"/>
+      <w:r>
+        <w:rPr>
+          <w:spacing w:val="-5"/>
+        </w:rPr>
+        <w:t>assessment, but</w:t>
+      </w:r>
+      <w:proofErr w:type="gramEnd"/>
+      <w:r>
+        <w:rPr>
+          <w:spacing w:val="-5"/>
+        </w:rPr>
+        <w:t xml:space="preserve"> can make up much of the substance – including, if you choose, reflections on your own self-assessment. </w:t>
+      </w:r>
+      <w:r>
+        <w:rPr>
+          <w:spacing w:val="-5"/>
+        </w:rPr>
         <w:t xml:space="preserve">See notes above for more details. </w:t>
       </w:r>
       <w:r>
         <w:rPr>
           <w:spacing w:val="-5"/>
         </w:rPr>
-        <w:t xml:space="preserve">Due Friday 16 October at 11:59 PM Central, the last day of Term A. Submit through </w:t>
+        <w:t xml:space="preserve">Due Friday 16 October at 11:59 PM Central, the last day of Term A. Submit </w:t>
       </w:r>
       <w:r>
         <w:rPr>
           <w:spacing w:val="-5"/>
         </w:rPr>
-        <w:t>Google Docs</w:t>
+        <w:t>by emailing me a link to the</w:t>
       </w:r>
       <w:r>
         <w:rPr>
           <w:spacing w:val="-5"/>
         </w:rPr>
+        <w:t xml:space="preserve"> </w:t>
+      </w:r>
+      <w:r>
+        <w:rPr>
+          <w:spacing w:val="-5"/>
+        </w:rPr>
+        <w:t>Google Doc</w:t>
+      </w:r>
+      <w:r>
+        <w:rPr>
+          <w:spacing w:val="-5"/>
+        </w:rPr>
+        <w:t xml:space="preserve"> or an attached Microsoft Word file</w:t>
+      </w:r>
+      <w:r>
+        <w:rPr>
+          <w:spacing w:val="-5"/>
+        </w:rPr>
         <w:t>.</w:t>
       </w:r>
     </w:p>
@@ -2645,7 +3576,6 @@
         <w:pStyle w:val="Heading3"/>
       </w:pPr>
       <w:r>
-        <w:lastRenderedPageBreak/>
         <w:t>Late</w:t>
       </w:r>
       <w:r>
@@ -2678,7 +3608,7 @@
         </w:rPr>
       </w:pPr>
       <w:r>
-        <w:t>The weekly cycle only works if it is weekly. A self-assessment written three weeks late is a memory exercise rather than a revision, and the peer commentary rounds depend on your classmates having something to read. Tell me before the deadline if you are going to be late and we will sort it out. The final report is the one hard deadline: because Term A grades are due to the University shortly after the term ends, extensions on it must be arranged with me in advance. If something serious is going on, talk to me — I would much rather grant an extension than receive nothing.</w:t>
+        <w:t xml:space="preserve">The weekly cycle may be challenging due to factors beyond your control – just inform me if you need more time. The final assessment deadline has limited flexibility, due to the deadline for submitting grades. Please contact me if you are going to be late, and we’ll work to sort it out. </w:t>
       </w:r>
     </w:p>
     <w:p>
@@ -2703,21 +3633,14 @@
           <w:rFonts w:eastAsia="Arial" w:cs="Arial"/>
           <w:color w:val="252525"/>
         </w:rPr>
-        <w:t>Regular class attendance is expected of all students at the university. The authority to excuse absences rests with the course instructors, subject to the requirement to reasonably accommodate class absences (see ‘Absence Policy’ below). Enrollment in this course includes expectation of regular attendance</w:t>
+        <w:t>Regular class attendance is expected of all students at the university</w:t>
       </w:r>
       <w:r>
         <w:rPr>
           <w:rFonts w:eastAsia="Arial" w:cs="Arial"/>
           <w:color w:val="252525"/>
         </w:rPr>
-        <w:t>,</w:t>
-      </w:r>
-      <w:r>
-        <w:rPr>
-          <w:rFonts w:eastAsia="Arial" w:cs="Arial"/>
-          <w:color w:val="252525"/>
-        </w:rPr>
-        <w:t xml:space="preserve"> and this is reflected in the Participation Grade. If you find you must miss (or have missed) class, contact the instructor as soon as possible. Repeated tardiness or leaving sessions early may be considered an unexcused absence unless alternate arrangements have been made with the instructor.</w:t>
+        <w:t xml:space="preserve">, and for this course, it will be difficult to support many of the activities and discussion asynchronously. Please let me know if you need to miss class, and I’ll try to accommodate. </w:t>
       </w:r>
     </w:p>
     <w:p>
@@ -2725,6 +3648,7 @@
         <w:pStyle w:val="Heading3"/>
       </w:pPr>
       <w:r>
+        <w:lastRenderedPageBreak/>
         <w:t>Absence</w:t>
       </w:r>
       <w:r>
@@ -2751,6 +3675,7 @@
         </w:rPr>
         <w:t xml:space="preserve">Attendance means joining the live Zoom seminar. Sessions are recorded and posted to </w:t>
       </w:r>
+      <w:proofErr w:type="spellStart"/>
       <w:r>
         <w:rPr>
           <w:rStyle w:val="Hyperlink"/>
@@ -2759,6 +3684,7 @@
         </w:rPr>
         <w:t>CGScholar</w:t>
       </w:r>
+      <w:proofErr w:type="spellEnd"/>
       <w:r>
         <w:rPr>
           <w:rStyle w:val="Hyperlink"/>
@@ -2816,7 +3742,7 @@
           <w:rFonts w:eastAsia="Arial" w:cs="Arial"/>
           <w:color w:val="000000" w:themeColor="text1"/>
         </w:rPr>
-        <w:t xml:space="preserve"> and through the peer commentary hurdle. Sustained absence from discussion will show up in both.</w:t>
+        <w:t xml:space="preserve"> and through the peer commentary hurdle. </w:t>
       </w:r>
     </w:p>
     <w:p>
@@ -2844,7 +3770,19 @@
         <w:rPr>
           <w:spacing w:val="-1"/>
         </w:rPr>
-        <w:t>Final letter grades are determined by total points earned out of 1000, converted to a percentage and mapped through the scale below. Grades are not curved. Rounding is to two decimal places. If you believe an error has been made in computing your final grade, email me within one week of grades being posted.</w:t>
+        <w:t xml:space="preserve">Final letter grades are determined by total </w:t>
+      </w:r>
+      <w:r>
+        <w:rPr>
+          <w:spacing w:val="-1"/>
+        </w:rPr>
+        <w:t>percentage</w:t>
+      </w:r>
+      <w:r>
+        <w:rPr>
+          <w:spacing w:val="-1"/>
+        </w:rPr>
+        <w:t xml:space="preserve"> and mapped through the scale below. Grades are not curved. Rounding is to two decimal places. If you believe an error has been made in computing your final grade, email me within one week of grades being posted.</w:t>
       </w:r>
     </w:p>
     <w:p>
@@ -2852,7 +3790,6 @@
         <w:pStyle w:val="Heading3"/>
       </w:pPr>
       <w:r>
-        <w:lastRenderedPageBreak/>
         <w:t>Grading Scale</w:t>
       </w:r>
     </w:p>
@@ -3128,6 +4065,7 @@
           </w:tcPr>
           <w:p>
             <w:r>
+              <w:lastRenderedPageBreak/>
               <w:t>66.00 - 69.99</w:t>
             </w:r>
           </w:p>
@@ -3243,7 +4181,7 @@
         </w:rPr>
         <w:t xml:space="preserve">The University of Illinois Urbana-Champaign </w:t>
       </w:r>
-      <w:hyperlink r:id="rId12">
+      <w:hyperlink r:id="rId17">
         <w:r>
           <w:rPr>
             <w:rStyle w:val="Hyperlink"/>
@@ -3288,7 +4226,7 @@
         </w:rPr>
         <w:t xml:space="preserve">Academic dishonesty may result in a failing grade. Every student is expected to review and abide by the </w:t>
       </w:r>
-      <w:hyperlink r:id="rId13">
+      <w:hyperlink r:id="rId18">
         <w:r>
           <w:rPr>
             <w:rStyle w:val="Hyperlink"/>
@@ -3353,7 +4291,6 @@
           <w:rFonts w:ascii="Arial" w:eastAsia="Arial" w:hAnsi="Arial" w:cs="Arial"/>
           <w:color w:val="161616"/>
         </w:rPr>
-        <w:lastRenderedPageBreak/>
         <w:t>Permitted and encouraged throughout: using AI to explore ideas, test arguments, find sources that you then verify independently, and stress-test your drafts. This is course material: a weekly chat session forms part of the assessed formative cycle.</w:t>
       </w:r>
     </w:p>
@@ -3430,6 +4367,7 @@
         <w:pStyle w:val="Heading3"/>
       </w:pPr>
       <w:r>
+        <w:lastRenderedPageBreak/>
         <w:t>Students</w:t>
       </w:r>
       <w:r>
@@ -3484,7 +4422,7 @@
       <w:r>
         <w:t xml:space="preserve">contact DRES as soon as possible. To contact DRES, please visit 1207 S. Oak Street, Champaign, call (217) 333-1970, email </w:t>
       </w:r>
-      <w:hyperlink r:id="rId14">
+      <w:hyperlink r:id="rId19">
         <w:r>
           <w:rPr>
             <w:rStyle w:val="Hyperlink"/>
@@ -3495,7 +4433,7 @@
       <w:r>
         <w:t xml:space="preserve">, or visit the </w:t>
       </w:r>
-      <w:hyperlink r:id="rId15">
+      <w:hyperlink r:id="rId20">
         <w:r>
           <w:rPr>
             <w:rStyle w:val="Hyperlink"/>
@@ -3552,7 +4490,7 @@
       <w:r>
         <w:t xml:space="preserve">See </w:t>
       </w:r>
-      <w:hyperlink r:id="rId16">
+      <w:hyperlink r:id="rId21">
         <w:r>
           <w:rPr>
             <w:rStyle w:val="Hyperlink"/>
@@ -3617,7 +4555,6 @@
         </w:numPr>
       </w:pPr>
       <w:r>
-        <w:lastRenderedPageBreak/>
         <w:t>Counseling Center (217) 333-3704</w:t>
       </w:r>
     </w:p>
@@ -3653,8 +4590,13 @@
           <w:numId w:val="41"/>
         </w:numPr>
       </w:pPr>
-      <w:r>
-        <w:t>Rosecrance Crisis Line (815) 720-4953 (available 24/7, 365 days a year)</w:t>
+      <w:proofErr w:type="spellStart"/>
+      <w:r>
+        <w:t>Rosecrance</w:t>
+      </w:r>
+      <w:proofErr w:type="spellEnd"/>
+      <w:r>
+        <w:t xml:space="preserve"> Crisis Line (815) 720-4953 (available 24/7, 365 days a year)</w:t>
       </w:r>
     </w:p>
     <w:p>
@@ -3749,16 +4691,32 @@
           <w:rFonts w:eastAsia="Arial" w:cs="Arial"/>
           <w:color w:val="161616"/>
         </w:rPr>
-        <w:t xml:space="preserve"> their well-being or yours, we encourage you to refer this behavior to the Connie Frank CARE Center (formerly the Student Assistance Center) in the Office of the Dean of Students.  You may do so by calling (217) 333-0050 or by submitting an </w:t>
-      </w:r>
+        <w:t xml:space="preserve"> their well-being or yours, we encourage you to refer this behavior to the Connie Frank CARE Center (formerly the Student Assistance Center) in the Office of the Dean of Students.  You may do so by calling (217) 333-0050 or by submitting </w:t>
+      </w:r>
+      <w:proofErr w:type="gramStart"/>
       <w:r>
         <w:rPr>
           <w:rFonts w:eastAsia="Arial" w:cs="Arial"/>
           <w:color w:val="161616"/>
         </w:rPr>
+        <w:t>an</w:t>
+      </w:r>
+      <w:proofErr w:type="gramEnd"/>
+      <w:r>
+        <w:rPr>
+          <w:rFonts w:eastAsia="Arial" w:cs="Arial"/>
+          <w:color w:val="161616"/>
+        </w:rPr>
+        <w:t xml:space="preserve"> </w:t>
+      </w:r>
+      <w:r>
+        <w:rPr>
+          <w:rFonts w:eastAsia="Arial" w:cs="Arial"/>
+          <w:color w:val="161616"/>
+        </w:rPr>
         <w:t xml:space="preserve">CARE </w:t>
       </w:r>
-      <w:hyperlink r:id="rId17" w:history="1">
+      <w:hyperlink r:id="rId22" w:history="1">
         <w:r>
           <w:rPr>
             <w:rStyle w:val="Hyperlink"/>
@@ -3806,9 +4764,10 @@
           <w:rFonts w:eastAsia="Arial" w:cs="Arial"/>
           <w:color w:val="161616"/>
         </w:rPr>
+        <w:lastRenderedPageBreak/>
         <w:t xml:space="preserve">Further, as a Community of Care, we want to support you in your overall wellness. We know that students sometimes face challenges that can impact academic performance (examples include mental health concerns, food insecurity, homelessness, personal emergencies). Should you find that you are managing such a challenge and that it is interfering with your coursework, you are encouraged to contact the </w:t>
       </w:r>
-      <w:hyperlink r:id="rId18">
+      <w:hyperlink r:id="rId23">
         <w:r>
           <w:rPr>
             <w:rStyle w:val="Hyperlink"/>
@@ -3852,7 +4811,7 @@
         </w:rPr>
         <w:t xml:space="preserve"> </w:t>
       </w:r>
-      <w:hyperlink r:id="rId19" w:history="1">
+      <w:hyperlink r:id="rId24" w:history="1">
         <w:r>
           <w:rPr>
             <w:rStyle w:val="Hyperlink"/>
@@ -3894,7 +4853,7 @@
         </w:rPr>
         <w:t xml:space="preserve">Behavior that persistently or grossly interferes with classroom activities is considered disruptive behavior and may be subject to disciplinary action. Such behavior inhibits other students’ ability to learn and an instructor’s ability to teach. A student responsible for disruptive behavior may be required to leave class pending discussion and resolution of the problem and may be reported using the </w:t>
       </w:r>
-      <w:hyperlink r:id="rId20">
+      <w:hyperlink r:id="rId25">
         <w:r>
           <w:rPr>
             <w:rStyle w:val="Hyperlink"/>
@@ -3907,17 +4866,9 @@
           <w:rFonts w:eastAsia="Arial" w:cs="Arial"/>
           <w:color w:val="141414"/>
         </w:rPr>
-        <w:t xml:space="preserve"> </w:t>
-      </w:r>
-      <w:r>
-        <w:rPr>
-          <w:rFonts w:eastAsia="Arial" w:cs="Arial"/>
-          <w:color w:val="141414"/>
-        </w:rPr>
-        <w:lastRenderedPageBreak/>
-        <w:t>(</w:t>
-      </w:r>
-      <w:hyperlink r:id="rId21">
+        <w:t xml:space="preserve"> (</w:t>
+      </w:r>
+      <w:hyperlink r:id="rId26">
         <w:r>
           <w:rPr>
             <w:rStyle w:val="Hyperlink"/>
@@ -3932,7 +4883,7 @@
         </w:rPr>
         <w:t>), email (</w:t>
       </w:r>
-      <w:hyperlink r:id="rId22">
+      <w:hyperlink r:id="rId27">
         <w:r>
           <w:rPr>
             <w:rStyle w:val="Hyperlink"/>
@@ -3966,7 +4917,7 @@
         </w:rPr>
         <w:t xml:space="preserve"> 333-3680 to the </w:t>
       </w:r>
-      <w:hyperlink r:id="rId23">
+      <w:hyperlink r:id="rId28">
         <w:r>
           <w:rPr>
             <w:rStyle w:val="Hyperlink"/>
@@ -3981,7 +4932,7 @@
         </w:rPr>
         <w:t xml:space="preserve"> (</w:t>
       </w:r>
-      <w:hyperlink r:id="rId24">
+      <w:hyperlink r:id="rId29">
         <w:r>
           <w:rPr>
             <w:rStyle w:val="Hyperlink"/>
@@ -4034,7 +4985,7 @@
         </w:rPr>
         <w:t xml:space="preserve">For emergency response recommendations and building floor plans, review </w:t>
       </w:r>
-      <w:hyperlink r:id="rId25">
+      <w:hyperlink r:id="rId30">
         <w:r>
           <w:rPr>
             <w:rStyle w:val="Hyperlink"/>
@@ -4051,7 +5002,7 @@
         </w:rPr>
         <w:t xml:space="preserve"> (https://police.illinois.edu/em/run-hide-fight/), </w:t>
       </w:r>
-      <w:hyperlink r:id="rId26">
+      <w:hyperlink r:id="rId31">
         <w:r>
           <w:rPr>
             <w:rStyle w:val="Hyperlink"/>
@@ -4068,7 +5019,7 @@
         </w:rPr>
         <w:t xml:space="preserve"> (https://eoc.illinois.edu/plans/eap/), and </w:t>
       </w:r>
-      <w:hyperlink r:id="rId27">
+      <w:hyperlink r:id="rId32">
         <w:r>
           <w:rPr>
             <w:rStyle w:val="Hyperlink"/>
@@ -4119,9 +5070,17 @@
           <w:rFonts w:eastAsia="Arial" w:cs="Arial"/>
           <w:color w:val="000000" w:themeColor="text1"/>
         </w:rPr>
-        <w:t xml:space="preserve">It is the policy of the University of Illinois Urbana-Champaign to reasonably accommodate its students’ religious beliefs, observances, and practices that conflict with a student’s class attendance or participation in a scheduled examination or work requirement, consistent with state and federal law. Students must make requests for accommodation in advance of the conflict to allow time for both consideration of the request and alternate procedures to be prepared. Requests should be directed to the instructor. An optional resource to assist students in making such requests can be found on the </w:t>
-      </w:r>
-      <w:hyperlink r:id="rId28">
+        <w:t xml:space="preserve">It is the policy of the University of Illinois Urbana-Champaign to reasonably accommodate its students’ religious beliefs, observances, and practices that conflict with a student’s class attendance or participation in a scheduled examination or work requirement, consistent with state and federal law. Students must make requests for </w:t>
+      </w:r>
+      <w:r>
+        <w:rPr>
+          <w:rFonts w:eastAsia="Arial" w:cs="Arial"/>
+          <w:color w:val="000000" w:themeColor="text1"/>
+        </w:rPr>
+        <w:lastRenderedPageBreak/>
+        <w:t xml:space="preserve">accommodation in advance of the conflict to allow time for both consideration of the request and alternate procedures to be prepared. Requests should be directed to the instructor. An optional resource to assist students in making such requests can be found on the </w:t>
+      </w:r>
+      <w:hyperlink r:id="rId33">
         <w:r>
           <w:rPr>
             <w:rStyle w:val="Hyperlink"/>
@@ -4199,7 +5158,7 @@
         </w:rPr>
         <w:t xml:space="preserve">A list of the designated University employees who, as counselors, confidential advisors, and medical professionals, do not have this reporting responsibility and can maintain confidentiality, can be found on </w:t>
       </w:r>
-      <w:hyperlink r:id="rId29" w:anchor="confidential">
+      <w:hyperlink r:id="rId34" w:anchor="confidential">
         <w:r>
           <w:rPr>
             <w:rStyle w:val="Hyperlink"/>
@@ -4214,7 +5173,7 @@
         </w:rPr>
         <w:t xml:space="preserve">  (https://wecare.illinois.edu/resources/students/#confidential) and on the </w:t>
       </w:r>
-      <w:hyperlink r:id="rId30">
+      <w:hyperlink r:id="rId35">
         <w:r>
           <w:rPr>
             <w:rStyle w:val="Hyperlink"/>
@@ -4229,7 +5188,7 @@
         </w:rPr>
         <w:t xml:space="preserve">. Other information about resources and reporting is available on </w:t>
       </w:r>
-      <w:hyperlink r:id="rId31">
+      <w:hyperlink r:id="rId36">
         <w:r>
           <w:rPr>
             <w:rStyle w:val="Hyperlink"/>
@@ -4244,7 +5203,7 @@
         </w:rPr>
         <w:t xml:space="preserve"> (https://wecare.illinois.edu/) and on the </w:t>
       </w:r>
-      <w:hyperlink r:id="rId32">
+      <w:hyperlink r:id="rId37">
         <w:r>
           <w:rPr>
             <w:rStyle w:val="Hyperlink"/>
@@ -4282,7 +5241,7 @@
         </w:rPr>
         <w:t xml:space="preserve">As a military-friendly institution, and per federal regulations and Illinois statutes, the University of Illinois Urbana-Champaign has established policies and procedures to accommodate military-connected students. In addition to the support available at the </w:t>
       </w:r>
-      <w:hyperlink r:id="rId33">
+      <w:hyperlink r:id="rId38">
         <w:r>
           <w:rPr>
             <w:rStyle w:val="Hyperlink"/>
@@ -4302,24 +5261,30 @@
         <w:rPr>
           <w:rFonts w:eastAsia="Arial" w:cs="Arial"/>
         </w:rPr>
-        <w:t>https://chezveteranscenter.ahs.illinois.edu/</w:t>
+        <w:t>https://chezveteranscenter.</w:t>
+      </w:r>
+      <w:proofErr w:type="spellStart"/>
+      <w:r>
+        <w:rPr>
+          <w:rFonts w:eastAsia="Arial" w:cs="Arial"/>
+        </w:rPr>
+        <w:t>ahs</w:t>
+      </w:r>
+      <w:proofErr w:type="spellEnd"/>
+      <w:r>
+        <w:rPr>
+          <w:rFonts w:eastAsia="Arial" w:cs="Arial"/>
+        </w:rPr>
+        <w:t>.illinois.edu/</w:t>
       </w:r>
       <w:r>
         <w:rPr>
           <w:rFonts w:eastAsia="Arial" w:cs="Arial"/>
           <w:color w:val="000000" w:themeColor="text1"/>
         </w:rPr>
-        <w:t xml:space="preserve">), members of the National Guard or Reserves and active-duty military personnel with military obligations (e.g., deployments, training, drills) are encouraged to communicate these, in advance </w:t>
-      </w:r>
-      <w:r>
-        <w:rPr>
-          <w:rFonts w:eastAsia="Arial" w:cs="Arial"/>
-          <w:color w:val="000000" w:themeColor="text1"/>
-        </w:rPr>
-        <w:lastRenderedPageBreak/>
-        <w:t xml:space="preserve">whenever possible, to the instructor. For policy details, see the Student Code on </w:t>
-      </w:r>
-      <w:hyperlink r:id="rId34">
+        <w:t xml:space="preserve">), members of the National Guard or Reserves and active-duty military personnel with military obligations (e.g., deployments, training, drills) are encouraged to communicate these, in advance whenever possible, to the instructor. For policy details, see the Student Code on </w:t>
+      </w:r>
+      <w:hyperlink r:id="rId39">
         <w:r>
           <w:rPr>
             <w:rStyle w:val="Hyperlink"/>
@@ -4490,12 +5455,16 @@
             <w:pPr>
               <w:pStyle w:val="ListBullet"/>
               <w:rPr>
+                <w:i/>
+                <w:iCs/>
                 <w:sz w:val="24"/>
                 <w:szCs w:val="24"/>
               </w:rPr>
             </w:pPr>
             <w:r>
               <w:rPr>
+                <w:i/>
+                <w:iCs/>
                 <w:sz w:val="24"/>
                 <w:szCs w:val="24"/>
               </w:rPr>
@@ -4515,7 +5484,39 @@
                 <w:sz w:val="24"/>
                 <w:szCs w:val="24"/>
               </w:rPr>
-              <w:t>Dialectic, and what it means for both sides to change</w:t>
+              <w:t>Introductions</w:t>
+            </w:r>
+          </w:p>
+          <w:p>
+            <w:pPr>
+              <w:pStyle w:val="ListBullet"/>
+              <w:rPr>
+                <w:sz w:val="24"/>
+                <w:szCs w:val="24"/>
+              </w:rPr>
+            </w:pPr>
+            <w:r>
+              <w:rPr>
+                <w:sz w:val="24"/>
+                <w:szCs w:val="24"/>
+              </w:rPr>
+              <w:t>Course and Assessment Overview</w:t>
+            </w:r>
+          </w:p>
+          <w:p>
+            <w:pPr>
+              <w:pStyle w:val="ListBullet"/>
+              <w:rPr>
+                <w:sz w:val="24"/>
+                <w:szCs w:val="24"/>
+              </w:rPr>
+            </w:pPr>
+            <w:r>
+              <w:rPr>
+                <w:sz w:val="24"/>
+                <w:szCs w:val="24"/>
+              </w:rPr>
+              <w:t>Initial questions on machine and human learning</w:t>
             </w:r>
           </w:p>
         </w:tc>
@@ -4531,11 +5532,47 @@
               </w:rPr>
             </w:pPr>
             <w:r>
+              <w:fldChar w:fldCharType="begin"/>
+            </w:r>
+            <w:r>
+              <w:instrText>HYPERLINK "https://cgscholar.com/posts/1849?communityId=150" \t "_blank"</w:instrText>
+            </w:r>
+            <w:r>
+              <w:fldChar w:fldCharType="separate"/>
+            </w:r>
+            <w:r>
+              <w:rPr>
+                <w:rStyle w:val="Hyperlink"/>
+              </w:rPr>
+              <w:t>Week 1 (August 24) - S</w:t>
+            </w:r>
+            <w:r>
+              <w:rPr>
+                <w:rStyle w:val="Hyperlink"/>
+              </w:rPr>
+              <w:t>y</w:t>
+            </w:r>
+            <w:r>
+              <w:rPr>
+                <w:rStyle w:val="Hyperlink"/>
+              </w:rPr>
+              <w:t>nthesis</w:t>
+            </w:r>
+            <w:r>
+              <w:fldChar w:fldCharType="end"/>
+            </w:r>
+            <w:r>
+              <w:br/>
+            </w:r>
+            <w:r>
+              <w:br/>
+            </w:r>
+            <w:r>
               <w:rPr>
                 <w:sz w:val="24"/>
                 <w:szCs w:val="24"/>
               </w:rPr>
-              <w:t>Reading: Hegel, Phenomenology of Spirit, Preface and Introduction; Brandom, A Spirit of Trust, Introduction</w:t>
+              <w:t>Baseline response written (not assessed)</w:t>
             </w:r>
           </w:p>
           <w:p>
@@ -4550,7 +5587,7 @@
                 <w:sz w:val="24"/>
                 <w:szCs w:val="24"/>
               </w:rPr>
-              <w:t>Baseline response written (not assessed)</w:t>
+              <w:t>First AI chat session</w:t>
             </w:r>
           </w:p>
           <w:p>
@@ -4560,13 +5597,6 @@
                 <w:szCs w:val="24"/>
               </w:rPr>
             </w:pPr>
-            <w:r>
-              <w:rPr>
-                <w:sz w:val="24"/>
-                <w:szCs w:val="24"/>
-              </w:rPr>
-              <w:t>First AI chat session</w:t>
-            </w:r>
           </w:p>
         </w:tc>
       </w:tr>
@@ -4587,6 +5617,7 @@
                 <w:sz w:val="24"/>
                 <w:szCs w:val="24"/>
               </w:rPr>
+              <w:lastRenderedPageBreak/>
               <w:t>Session 2</w:t>
             </w:r>
           </w:p>
@@ -4614,12 +5645,16 @@
             <w:pPr>
               <w:pStyle w:val="ListBullet"/>
               <w:rPr>
+                <w:i/>
+                <w:iCs/>
                 <w:sz w:val="24"/>
                 <w:szCs w:val="24"/>
               </w:rPr>
             </w:pPr>
             <w:r>
               <w:rPr>
+                <w:i/>
+                <w:iCs/>
                 <w:sz w:val="24"/>
                 <w:szCs w:val="24"/>
               </w:rPr>
@@ -4629,18 +5664,15 @@
           <w:p>
             <w:pPr>
               <w:pStyle w:val="ListBullet"/>
+              <w:numPr>
+                <w:ilvl w:val="0"/>
+                <w:numId w:val="0"/>
+              </w:numPr>
               <w:rPr>
                 <w:sz w:val="24"/>
                 <w:szCs w:val="24"/>
               </w:rPr>
             </w:pPr>
-            <w:r>
-              <w:rPr>
-                <w:sz w:val="24"/>
-                <w:szCs w:val="24"/>
-              </w:rPr>
-              <w:t>Expectation, encounter, contradiction, revision</w:t>
-            </w:r>
           </w:p>
         </w:tc>
         <w:tc>
@@ -4654,12 +5686,26 @@
                 <w:szCs w:val="24"/>
               </w:rPr>
             </w:pPr>
+            <w:hyperlink r:id="rId40" w:tgtFrame="_blank" w:history="1">
+              <w:r>
+                <w:rPr>
+                  <w:rStyle w:val="Hyperlink"/>
+                </w:rPr>
+                <w:t>Week 2 (August 31) - Experience</w:t>
+              </w:r>
+            </w:hyperlink>
+            <w:r>
+              <w:br/>
+            </w:r>
+            <w:r>
+              <w:br/>
+            </w:r>
             <w:r>
               <w:rPr>
                 <w:sz w:val="24"/>
                 <w:szCs w:val="24"/>
               </w:rPr>
-              <w:t>Reading: Hegel, “Sense-Certainty,” “Perception,” “Force and the Understanding”</w:t>
+              <w:t>Formative self-assessment 1</w:t>
             </w:r>
           </w:p>
           <w:p>
@@ -4669,13 +5715,6 @@
                 <w:szCs w:val="24"/>
               </w:rPr>
             </w:pPr>
-            <w:r>
-              <w:rPr>
-                <w:sz w:val="24"/>
-                <w:szCs w:val="24"/>
-              </w:rPr>
-              <w:t>Formative self-assessment 1</w:t>
-            </w:r>
           </w:p>
         </w:tc>
       </w:tr>
@@ -4770,6 +5809,7 @@
               </w:rPr>
               <w:t xml:space="preserve">No live seminar and no self-assessment due. Use the week to get ahead on the Phenomenology; asynchronous materials are posted on </w:t>
             </w:r>
+            <w:proofErr w:type="spellStart"/>
             <w:r>
               <w:rPr>
                 <w:sz w:val="24"/>
@@ -4777,13 +5817,38 @@
               </w:rPr>
               <w:t>CGScholar</w:t>
             </w:r>
+            <w:proofErr w:type="spellEnd"/>
             <w:r>
               <w:rPr>
                 <w:sz w:val="24"/>
                 <w:szCs w:val="24"/>
               </w:rPr>
-              <w:t>.</w:t>
-            </w:r>
+              <w:t>:</w:t>
+            </w:r>
+            <w:r>
+              <w:rPr>
+                <w:sz w:val="24"/>
+                <w:szCs w:val="24"/>
+              </w:rPr>
+              <w:br/>
+            </w:r>
+            <w:r>
+              <w:rPr>
+                <w:sz w:val="24"/>
+                <w:szCs w:val="24"/>
+              </w:rPr>
+              <w:br/>
+            </w:r>
+            <w:hyperlink r:id="rId41" w:tgtFrame="_blank" w:history="1">
+              <w:r>
+                <w:rPr>
+                  <w:rStyle w:val="Hyperlink"/>
+                  <w:sz w:val="24"/>
+                  <w:szCs w:val="24"/>
+                </w:rPr>
+                <w:t>Week 3 (September 14) - Recognition and Consciousness</w:t>
+              </w:r>
+            </w:hyperlink>
           </w:p>
         </w:tc>
       </w:tr>
@@ -4837,27 +5902,42 @@
             </w:pPr>
             <w:r>
               <w:rPr>
+                <w:i/>
+                <w:iCs/>
                 <w:sz w:val="24"/>
                 <w:szCs w:val="24"/>
               </w:rPr>
               <w:t>Recognition</w:t>
+            </w:r>
+            <w:r>
+              <w:rPr>
+                <w:sz w:val="24"/>
+                <w:szCs w:val="24"/>
+              </w:rPr>
+              <w:t xml:space="preserve"> and </w:t>
+            </w:r>
+            <w:r>
+              <w:rPr>
+                <w:i/>
+                <w:iCs/>
+                <w:sz w:val="24"/>
+                <w:szCs w:val="24"/>
+              </w:rPr>
+              <w:t>Consciousness</w:t>
             </w:r>
           </w:p>
           <w:p>
             <w:pPr>
               <w:pStyle w:val="ListBullet"/>
+              <w:numPr>
+                <w:ilvl w:val="0"/>
+                <w:numId w:val="0"/>
+              </w:numPr>
               <w:rPr>
                 <w:sz w:val="24"/>
                 <w:szCs w:val="24"/>
               </w:rPr>
             </w:pPr>
-            <w:r>
-              <w:rPr>
-                <w:sz w:val="24"/>
-                <w:szCs w:val="24"/>
-              </w:rPr>
-              <w:t>Identification, validation, compliance, reciprocity</w:t>
-            </w:r>
           </w:p>
         </w:tc>
         <w:tc>
@@ -4871,13 +5951,26 @@
                 <w:szCs w:val="24"/>
               </w:rPr>
             </w:pPr>
-            <w:r>
-              <w:rPr>
-                <w:sz w:val="24"/>
-                <w:szCs w:val="24"/>
-              </w:rPr>
-              <w:t>Reading: Hegel, ¶161–196, “Lordship and Bondage”; Čapek, R.U.R.</w:t>
-            </w:r>
+            <w:hyperlink r:id="rId42" w:tgtFrame="_blank" w:history="1">
+              <w:r>
+                <w:rPr>
+                  <w:rStyle w:val="Hyperlink"/>
+                  <w:sz w:val="24"/>
+                  <w:szCs w:val="24"/>
+                </w:rPr>
+                <w:t xml:space="preserve">Week 3 (September 14) - Recognition and </w:t>
+              </w:r>
+              <w:proofErr w:type="spellStart"/>
+              <w:r>
+                <w:rPr>
+                  <w:rStyle w:val="Hyperlink"/>
+                  <w:sz w:val="24"/>
+                  <w:szCs w:val="24"/>
+                </w:rPr>
+                <w:t>Consciousness</w:t>
+              </w:r>
+            </w:hyperlink>
+            <w:proofErr w:type="spellEnd"/>
           </w:p>
           <w:p>
             <w:pPr>
@@ -4906,8 +5999,16 @@
                 <w:sz w:val="24"/>
                 <w:szCs w:val="24"/>
               </w:rPr>
-              <w:t>Peer commentary round 1 opens (Sessions 3/4)</w:t>
-            </w:r>
+              <w:t>Peer commentary 1: three comments on peers’ revised responses</w:t>
+            </w:r>
+          </w:p>
+          <w:p>
+            <w:pPr>
+              <w:rPr>
+                <w:sz w:val="24"/>
+                <w:szCs w:val="24"/>
+              </w:rPr>
+            </w:pPr>
           </w:p>
         </w:tc>
       </w:tr>
@@ -4966,29 +6067,6 @@
               </w:rPr>
               <w:t>Attention</w:t>
             </w:r>
-            <w:r>
-              <w:rPr>
-                <w:sz w:val="24"/>
-                <w:szCs w:val="24"/>
-              </w:rPr>
-              <w:t xml:space="preserve"> / Consciousness</w:t>
-            </w:r>
-          </w:p>
-          <w:p>
-            <w:pPr>
-              <w:pStyle w:val="ListBullet"/>
-              <w:rPr>
-                <w:sz w:val="24"/>
-                <w:szCs w:val="24"/>
-              </w:rPr>
-            </w:pPr>
-            <w:r>
-              <w:rPr>
-                <w:sz w:val="24"/>
-                <w:szCs w:val="24"/>
-              </w:rPr>
-              <w:t>Selection in transformers and in brains</w:t>
-            </w:r>
           </w:p>
         </w:tc>
         <w:tc>
@@ -5002,26 +6080,36 @@
                 <w:szCs w:val="24"/>
               </w:rPr>
             </w:pPr>
+            <w:hyperlink r:id="rId43" w:tgtFrame="_blank" w:history="1">
+              <w:r>
+                <w:rPr>
+                  <w:rStyle w:val="Hyperlink"/>
+                  <w:sz w:val="24"/>
+                  <w:szCs w:val="24"/>
+                </w:rPr>
+                <w:t>Week 4 (September 21) - Attention</w:t>
+              </w:r>
+            </w:hyperlink>
             <w:r>
               <w:rPr>
                 <w:sz w:val="24"/>
                 <w:szCs w:val="24"/>
               </w:rPr>
-              <w:t>Reading: Vaswani et al., “Attention Is All You Need”; Petersen and Posner</w:t>
+              <w:br/>
             </w:r>
             <w:r>
               <w:rPr>
                 <w:sz w:val="24"/>
                 <w:szCs w:val="24"/>
               </w:rPr>
-              <w:t xml:space="preserve">; </w:t>
+              <w:br/>
             </w:r>
             <w:r>
               <w:rPr>
                 <w:sz w:val="24"/>
                 <w:szCs w:val="24"/>
               </w:rPr>
-              <w:t>Hayles, Unthought; Freud, “The Unconscious”; Reading:</w:t>
+              <w:t>Formative self-assessment 3</w:t>
             </w:r>
           </w:p>
           <w:p>
@@ -5036,7 +6124,7 @@
                 <w:sz w:val="24"/>
                 <w:szCs w:val="24"/>
               </w:rPr>
-              <w:t>Formative self-assessment 3</w:t>
+              <w:t>Instructor commentary returned</w:t>
             </w:r>
           </w:p>
           <w:p>
@@ -5046,14 +6134,6 @@
                 <w:szCs w:val="24"/>
               </w:rPr>
             </w:pPr>
-            <w:r>
-              <w:rPr>
-                <w:sz w:val="24"/>
-                <w:szCs w:val="24"/>
-              </w:rPr>
-              <w:lastRenderedPageBreak/>
-              <w:t>Peer commentary round 1 closes</w:t>
-            </w:r>
           </w:p>
         </w:tc>
       </w:tr>
@@ -5074,7 +6154,6 @@
                 <w:sz w:val="24"/>
                 <w:szCs w:val="24"/>
               </w:rPr>
-              <w:lastRenderedPageBreak/>
               <w:t>Session 5</w:t>
             </w:r>
           </w:p>
@@ -5142,12 +6221,36 @@
                 <w:szCs w:val="24"/>
               </w:rPr>
             </w:pPr>
+            <w:hyperlink r:id="rId44" w:tgtFrame="_blank" w:history="1">
+              <w:r>
+                <w:rPr>
+                  <w:rStyle w:val="Hyperlink"/>
+                  <w:sz w:val="24"/>
+                  <w:szCs w:val="24"/>
+                </w:rPr>
+                <w:t>Week 5 (September 28) - Alignment</w:t>
+              </w:r>
+            </w:hyperlink>
             <w:r>
               <w:rPr>
                 <w:sz w:val="24"/>
                 <w:szCs w:val="24"/>
               </w:rPr>
-              <w:t>Formative self-assessment 5</w:t>
+              <w:br/>
+            </w:r>
+            <w:r>
+              <w:rPr>
+                <w:sz w:val="24"/>
+                <w:szCs w:val="24"/>
+              </w:rPr>
+              <w:br/>
+            </w:r>
+            <w:r>
+              <w:rPr>
+                <w:sz w:val="24"/>
+                <w:szCs w:val="24"/>
+              </w:rPr>
+              <w:t>Formative self-assessment 4</w:t>
             </w:r>
           </w:p>
           <w:p>
@@ -5157,13 +6260,6 @@
                 <w:szCs w:val="24"/>
               </w:rPr>
             </w:pPr>
-            <w:r>
-              <w:rPr>
-                <w:sz w:val="24"/>
-                <w:szCs w:val="24"/>
-              </w:rPr>
-              <w:t>Peer commentary round 2 opens (Sessions 6/7)</w:t>
-            </w:r>
           </w:p>
         </w:tc>
       </w:tr>
@@ -5199,6 +6295,7 @@
                 <w:sz w:val="24"/>
                 <w:szCs w:val="24"/>
               </w:rPr>
+              <w:lastRenderedPageBreak/>
               <w:t>Mon 5 Oct</w:t>
             </w:r>
           </w:p>
@@ -5220,6 +6317,7 @@
                 <w:sz w:val="24"/>
                 <w:szCs w:val="24"/>
               </w:rPr>
+              <w:lastRenderedPageBreak/>
               <w:t>Critique</w:t>
             </w:r>
           </w:p>
@@ -5236,6 +6334,7 @@
                 <w:sz w:val="24"/>
                 <w:szCs w:val="24"/>
               </w:rPr>
+              <w:lastRenderedPageBreak/>
               <w:t>Immanent rather than merely external critique</w:t>
             </w:r>
           </w:p>
@@ -5256,7 +6355,8 @@
                 <w:sz w:val="24"/>
                 <w:szCs w:val="24"/>
               </w:rPr>
-              <w:t>Reading: Goodlad and Stone, “Beyond Chatbot-K”; Gebru and Torres, “The TESCREAL Bundle”; Stahl, “What Is Immanent Critique?”</w:t>
+              <w:lastRenderedPageBreak/>
+              <w:t>Formative self-assessment 5</w:t>
             </w:r>
           </w:p>
           <w:p>
@@ -5266,12 +6366,22 @@
                 <w:szCs w:val="24"/>
               </w:rPr>
             </w:pPr>
+            <w:hyperlink r:id="rId45" w:tgtFrame="_blank" w:history="1">
+              <w:r>
+                <w:rPr>
+                  <w:rStyle w:val="Hyperlink"/>
+                  <w:sz w:val="24"/>
+                  <w:szCs w:val="24"/>
+                </w:rPr>
+                <w:t>Week 6 (October 5) - Critique</w:t>
+              </w:r>
+            </w:hyperlink>
             <w:r>
               <w:rPr>
                 <w:sz w:val="24"/>
                 <w:szCs w:val="24"/>
               </w:rPr>
-              <w:t>Reading: Hegel, concluding passages; Hayles revisited; Marx, The Poverty of Philosophy</w:t>
+              <w:br/>
             </w:r>
           </w:p>
           <w:p>
@@ -5286,52 +6396,7 @@
                 <w:sz w:val="24"/>
                 <w:szCs w:val="24"/>
               </w:rPr>
-              <w:t>Formative self-assessment 6</w:t>
-            </w:r>
-          </w:p>
-          <w:p>
-            <w:pPr>
-              <w:rPr>
-                <w:sz w:val="24"/>
-                <w:szCs w:val="24"/>
-              </w:rPr>
-            </w:pPr>
-            <w:r>
-              <w:rPr>
-                <w:sz w:val="24"/>
-                <w:szCs w:val="24"/>
-              </w:rPr>
-              <w:t>Peer commentary round 2 closes</w:t>
-            </w:r>
-          </w:p>
-          <w:p>
-            <w:pPr>
-              <w:rPr>
-                <w:sz w:val="24"/>
-                <w:szCs w:val="24"/>
-              </w:rPr>
-            </w:pPr>
-            <w:r>
-              <w:rPr>
-                <w:sz w:val="24"/>
-                <w:szCs w:val="24"/>
-              </w:rPr>
-              <w:t>Instructor commentary returned</w:t>
-            </w:r>
-          </w:p>
-          <w:p>
-            <w:pPr>
-              <w:rPr>
-                <w:sz w:val="24"/>
-                <w:szCs w:val="24"/>
-              </w:rPr>
-            </w:pPr>
-            <w:r>
-              <w:rPr>
-                <w:sz w:val="24"/>
-                <w:szCs w:val="24"/>
-              </w:rPr>
-              <w:t>Final synthesis report due Fri 16 Oct, 11:59 PM</w:t>
+              <w:t>Peer commentary 2: three comments on peers’ revised responses</w:t>
             </w:r>
           </w:p>
         </w:tc>
@@ -5353,6 +6418,7 @@
                 <w:sz w:val="24"/>
                 <w:szCs w:val="24"/>
               </w:rPr>
+              <w:lastRenderedPageBreak/>
               <w:t>Session 7</w:t>
             </w:r>
           </w:p>
@@ -5384,6 +6450,7 @@
                 <w:szCs w:val="24"/>
               </w:rPr>
             </w:pPr>
+            <w:proofErr w:type="spellStart"/>
             <w:r>
               <w:rPr>
                 <w:sz w:val="24"/>
@@ -5396,7 +6463,15 @@
                 <w:sz w:val="24"/>
                 <w:szCs w:val="24"/>
               </w:rPr>
-              <w:t>echnosymbiosis and history; where the eight concepts leave us</w:t>
+              <w:t>echnosymbiosis</w:t>
+            </w:r>
+            <w:proofErr w:type="spellEnd"/>
+            <w:r>
+              <w:rPr>
+                <w:sz w:val="24"/>
+                <w:szCs w:val="24"/>
+              </w:rPr>
+              <w:t xml:space="preserve"> and history; where the eight concepts leave us</w:t>
             </w:r>
           </w:p>
         </w:tc>
@@ -5411,13 +6486,43 @@
                 <w:szCs w:val="24"/>
               </w:rPr>
             </w:pPr>
-            <w:r>
-              <w:rPr>
-                <w:sz w:val="24"/>
-                <w:szCs w:val="24"/>
-              </w:rPr>
-              <w:t>Reading: Hegel, concluding passages; Hayles revisited; Marx, The Poverty of Philosophy</w:t>
-            </w:r>
+            <w:hyperlink r:id="rId46" w:tgtFrame="_blank" w:history="1">
+              <w:r>
+                <w:rPr>
+                  <w:rStyle w:val="Hyperlink"/>
+                  <w:sz w:val="24"/>
+                  <w:szCs w:val="24"/>
+                </w:rPr>
+                <w:t xml:space="preserve">Week 7 (October 12) - </w:t>
+              </w:r>
+              <w:proofErr w:type="spellStart"/>
+              <w:r>
+                <w:rPr>
+                  <w:rStyle w:val="Hyperlink"/>
+                  <w:sz w:val="24"/>
+                  <w:szCs w:val="24"/>
+                </w:rPr>
+                <w:t>Technosymbiosis</w:t>
+              </w:r>
+              <w:proofErr w:type="spellEnd"/>
+              <w:r>
+                <w:rPr>
+                  <w:rStyle w:val="Hyperlink"/>
+                  <w:sz w:val="24"/>
+                  <w:szCs w:val="24"/>
+                </w:rPr>
+                <w:t xml:space="preserve"> / Return to </w:t>
+              </w:r>
+              <w:proofErr w:type="spellStart"/>
+              <w:r>
+                <w:rPr>
+                  <w:rStyle w:val="Hyperlink"/>
+                  <w:sz w:val="24"/>
+                  <w:szCs w:val="24"/>
+                </w:rPr>
+                <w:t>Synthesis</w:t>
+              </w:r>
+            </w:hyperlink>
           </w:p>
           <w:p>
             <w:pPr>
@@ -5431,7 +6536,15 @@
                 <w:sz w:val="24"/>
                 <w:szCs w:val="24"/>
               </w:rPr>
-              <w:t>Formative self-assessment 6</w:t>
+              <w:t>N</w:t>
+            </w:r>
+            <w:proofErr w:type="spellEnd"/>
+            <w:r>
+              <w:rPr>
+                <w:sz w:val="24"/>
+                <w:szCs w:val="24"/>
+              </w:rPr>
+              <w:t>o self-assessment: the session is given over to the final report</w:t>
             </w:r>
           </w:p>
           <w:p>
@@ -5446,7 +6559,7 @@
                 <w:sz w:val="24"/>
                 <w:szCs w:val="24"/>
               </w:rPr>
-              <w:t>Peer commentary round 2 closes</w:t>
+              <w:t>Instructor commentary returned</w:t>
             </w:r>
           </w:p>
           <w:p>
@@ -5461,22 +6574,23 @@
                 <w:sz w:val="24"/>
                 <w:szCs w:val="24"/>
               </w:rPr>
-              <w:t>Instructor commentary returned</w:t>
-            </w:r>
-          </w:p>
-          <w:p>
-            <w:pPr>
+              <w:t xml:space="preserve">Final synthesis </w:t>
+            </w:r>
+            <w:proofErr w:type="gramStart"/>
+            <w:r>
               <w:rPr>
                 <w:sz w:val="24"/>
                 <w:szCs w:val="24"/>
               </w:rPr>
-            </w:pPr>
+              <w:t>report</w:t>
+            </w:r>
+            <w:proofErr w:type="gramEnd"/>
             <w:r>
               <w:rPr>
                 <w:sz w:val="24"/>
                 <w:szCs w:val="24"/>
               </w:rPr>
-              <w:t>Final synthesis report due Fri 16 Oct, 11:59 PM</w:t>
+              <w:t xml:space="preserve"> due Fri 16 Oct, 11:59 PM</w:t>
             </w:r>
           </w:p>
         </w:tc>
@@ -5484,10 +6598,10 @@
     </w:tbl>
     <w:p/>
     <w:sectPr>
-      <w:headerReference w:type="default" r:id="rId35"/>
-      <w:footerReference w:type="even" r:id="rId36"/>
-      <w:footerReference w:type="default" r:id="rId37"/>
-      <w:footerReference w:type="first" r:id="rId38"/>
+      <w:headerReference w:type="default" r:id="rId47"/>
+      <w:footerReference w:type="even" r:id="rId48"/>
+      <w:footerReference w:type="default" r:id="rId49"/>
+      <w:footerReference w:type="first" r:id="rId50"/>
       <w:pgSz w:w="12240" w:h="15840"/>
       <w:pgMar w:top="1440" w:right="1440" w:bottom="1440" w:left="1440" w:header="144" w:footer="288" w:gutter="0"/>
       <w:cols w:space="720"/>

</xml_diff>

<commit_message>
479: instructor commentary runs parallel to peer rounds, in Sessions 4 and 6
</commit_message>
<xml_diff>
--- a/courses/479-fall-2026/syllabus/University of Illinois Urbana-Champaign Syllabus 479 Fall 2026.docx
+++ b/courses/479-fall-2026/syllabus/University of Illinois Urbana-Champaign Syllabus 479 Fall 2026.docx
@@ -676,81 +676,88 @@
         </w:rPr>
         <w:t xml:space="preserve"> </w:t>
       </w:r>
+      <w:r>
+        <w:rPr>
+          <w:spacing w:val="-2"/>
+        </w:rPr>
+        <w:t>eig</w:t>
+      </w:r>
+      <w:r>
+        <w:rPr>
+          <w:spacing w:val="-2"/>
+        </w:rPr>
+        <w:t>ht</w:t>
+      </w:r>
+      <w:r>
+        <w:rPr>
+          <w:spacing w:val="-2"/>
+        </w:rPr>
+        <w:t xml:space="preserve"> key concepts that each have something to say about facets of learning</w:t>
+      </w:r>
+      <w:r>
+        <w:rPr>
+          <w:spacing w:val="-2"/>
+        </w:rPr>
+        <w:t>, both human and machinic</w:t>
+      </w:r>
+      <w:r>
+        <w:rPr>
+          <w:spacing w:val="-2"/>
+        </w:rPr>
+        <w:t>:</w:t>
+      </w:r>
+      <w:r>
+        <w:rPr>
+          <w:spacing w:val="-2"/>
+        </w:rPr>
+        <w:t xml:space="preserve"> </w:t>
+      </w:r>
+      <w:r>
+        <w:rPr>
+          <w:spacing w:val="-2"/>
+        </w:rPr>
+        <w:t>synthesis</w:t>
+      </w:r>
+      <w:r>
+        <w:rPr>
+          <w:spacing w:val="-2"/>
+        </w:rPr>
+        <w:t xml:space="preserve">, </w:t>
+      </w:r>
+      <w:r>
+        <w:rPr>
+          <w:spacing w:val="-2"/>
+        </w:rPr>
+        <w:t xml:space="preserve">experience, recognition, </w:t>
+      </w:r>
+      <w:r>
+        <w:rPr>
+          <w:spacing w:val="-2"/>
+        </w:rPr>
+        <w:t xml:space="preserve">consciousness, </w:t>
+      </w:r>
+      <w:r>
+        <w:rPr>
+          <w:spacing w:val="-2"/>
+        </w:rPr>
+        <w:t xml:space="preserve">attention, alignment, critique, and </w:t>
+      </w:r>
       <w:proofErr w:type="spellStart"/>
       <w:r>
+        <w:t>technosymbiosis</w:t>
+      </w:r>
+      <w:proofErr w:type="spellEnd"/>
+      <w:r>
         <w:rPr>
           <w:spacing w:val="-2"/>
         </w:rPr>
-        <w:t>eigth</w:t>
-      </w:r>
-      <w:proofErr w:type="spellEnd"/>
+        <w:t xml:space="preserve"> </w:t>
+      </w:r>
       <w:r>
         <w:rPr>
           <w:spacing w:val="-2"/>
         </w:rPr>
-        <w:t xml:space="preserve"> key concepts that each have something to say about facets of learning</w:t>
-      </w:r>
-      <w:r>
-        <w:rPr>
-          <w:spacing w:val="-2"/>
-        </w:rPr>
-        <w:t>, both human and machinic</w:t>
-      </w:r>
-      <w:r>
-        <w:rPr>
-          <w:spacing w:val="-2"/>
-        </w:rPr>
-        <w:t>:</w:t>
-      </w:r>
-      <w:r>
-        <w:rPr>
-          <w:spacing w:val="-2"/>
-        </w:rPr>
-        <w:t xml:space="preserve"> </w:t>
-      </w:r>
-      <w:r>
-        <w:rPr>
-          <w:spacing w:val="-2"/>
-        </w:rPr>
-        <w:t>synthesis</w:t>
-      </w:r>
-      <w:r>
-        <w:rPr>
-          <w:spacing w:val="-2"/>
-        </w:rPr>
-        <w:t xml:space="preserve">, </w:t>
-      </w:r>
-      <w:r>
-        <w:rPr>
-          <w:spacing w:val="-2"/>
-        </w:rPr>
-        <w:t xml:space="preserve">experience, recognition, </w:t>
-      </w:r>
-      <w:r>
-        <w:rPr>
-          <w:spacing w:val="-2"/>
-        </w:rPr>
-        <w:t xml:space="preserve">consciousness, </w:t>
-      </w:r>
-      <w:r>
-        <w:rPr>
-          <w:spacing w:val="-2"/>
-        </w:rPr>
-        <w:t xml:space="preserve">attention, alignment, critique, and </w:t>
-      </w:r>
-      <w:proofErr w:type="spellStart"/>
-      <w:r>
-        <w:rPr>
-          <w:spacing w:val="-2"/>
-        </w:rPr>
-        <w:t>technogenesis</w:t>
-      </w:r>
-      <w:proofErr w:type="spellEnd"/>
-      <w:r>
-        <w:rPr>
-          <w:spacing w:val="-2"/>
-        </w:rPr>
-        <w:t xml:space="preserve"> (or </w:t>
+        <w:t xml:space="preserve">(or </w:t>
       </w:r>
       <w:r>
         <w:rPr>
@@ -1928,13 +1935,55 @@
         <w:rPr>
           <w:rFonts w:eastAsia="Arial" w:cs="Arial"/>
         </w:rPr>
-        <w:t>Twice during the course you’ll be asked to make a comment of a paragraph or so on a peer’s work to date.</w:t>
+        <w:t xml:space="preserve">Twice during the course you’ll be asked to make a comment of a paragraph or so on </w:t>
+      </w:r>
+      <w:r>
+        <w:rPr>
+          <w:rFonts w:eastAsia="Arial" w:cs="Arial"/>
+        </w:rPr>
+        <w:t>three</w:t>
+      </w:r>
+      <w:r>
+        <w:rPr>
+          <w:rFonts w:eastAsia="Arial" w:cs="Arial"/>
+        </w:rPr>
+        <w:t xml:space="preserve"> peer’s work</w:t>
+      </w:r>
+      <w:r>
+        <w:rPr>
+          <w:rFonts w:eastAsia="Arial" w:cs="Arial"/>
+        </w:rPr>
+        <w:t>-</w:t>
+      </w:r>
+      <w:r>
+        <w:rPr>
+          <w:rFonts w:eastAsia="Arial" w:cs="Arial"/>
+        </w:rPr>
+        <w:t>to</w:t>
+      </w:r>
+      <w:r>
+        <w:rPr>
+          <w:rFonts w:eastAsia="Arial" w:cs="Arial"/>
+        </w:rPr>
+        <w:t>-</w:t>
+      </w:r>
+      <w:r>
+        <w:rPr>
+          <w:rFonts w:eastAsia="Arial" w:cs="Arial"/>
+        </w:rPr>
+        <w:t>date.</w:t>
       </w:r>
       <w:r>
         <w:rPr>
           <w:rFonts w:eastAsia="Arial" w:cs="Arial"/>
         </w:rPr>
         <w:t xml:space="preserve"> These will be graded as just PASS (done) / FAIL (not done).</w:t>
+      </w:r>
+      <w:r>
+        <w:rPr>
+          <w:rFonts w:eastAsia="Arial" w:cs="Arial"/>
+        </w:rPr>
+        <w:t xml:space="preserve"> </w:t>
       </w:r>
       <w:r>
         <w:rPr>
@@ -2366,7 +2415,57 @@
         <w:rPr>
           <w:rFonts w:eastAsia="Arial" w:cs="Arial"/>
         </w:rPr>
-        <w:t xml:space="preserve"> should be included in some way: experience, recognition, attention, consciousness, alignment, critique, synthesis.</w:t>
+        <w:t xml:space="preserve"> should be included in some way: </w:t>
+      </w:r>
+      <w:r>
+        <w:rPr>
+          <w:rFonts w:eastAsia="Arial" w:cs="Arial"/>
+        </w:rPr>
+        <w:t>synthesis</w:t>
+      </w:r>
+      <w:r>
+        <w:rPr>
+          <w:rFonts w:eastAsia="Arial" w:cs="Arial"/>
+        </w:rPr>
+        <w:t xml:space="preserve">, </w:t>
+      </w:r>
+      <w:r>
+        <w:rPr>
+          <w:rFonts w:eastAsia="Arial" w:cs="Arial"/>
+        </w:rPr>
+        <w:t xml:space="preserve">experience, recognition, </w:t>
+      </w:r>
+      <w:r>
+        <w:rPr>
+          <w:rFonts w:eastAsia="Arial" w:cs="Arial"/>
+        </w:rPr>
+        <w:t xml:space="preserve">consciousness, </w:t>
+      </w:r>
+      <w:r>
+        <w:rPr>
+          <w:rFonts w:eastAsia="Arial" w:cs="Arial"/>
+        </w:rPr>
+        <w:t>attention, alignment, critique,</w:t>
+      </w:r>
+      <w:r>
+        <w:rPr>
+          <w:rFonts w:eastAsia="Arial" w:cs="Arial"/>
+        </w:rPr>
+        <w:t xml:space="preserve"> </w:t>
+      </w:r>
+      <w:proofErr w:type="spellStart"/>
+      <w:r>
+        <w:rPr>
+          <w:rFonts w:eastAsia="Arial" w:cs="Arial"/>
+        </w:rPr>
+        <w:t>technosymbiosis</w:t>
+      </w:r>
+      <w:proofErr w:type="spellEnd"/>
+      <w:r>
+        <w:rPr>
+          <w:rFonts w:eastAsia="Arial" w:cs="Arial"/>
+        </w:rPr>
+        <w:t>.</w:t>
       </w:r>
     </w:p>
     <w:p>
@@ -2908,7 +3007,31 @@
               <w:rPr>
                 <w:rFonts w:eastAsia="Arial" w:cs="Arial"/>
               </w:rPr>
-              <w:t>0–500 words on how you define machine learning and human learning, their relationship, and the question you most want answered. Written in the first fortnight. Not graded.</w:t>
+              <w:t>0–</w:t>
+            </w:r>
+            <w:r>
+              <w:rPr>
+                <w:rFonts w:eastAsia="Arial" w:cs="Arial"/>
+              </w:rPr>
+              <w:t>3</w:t>
+            </w:r>
+            <w:r>
+              <w:rPr>
+                <w:rFonts w:eastAsia="Arial" w:cs="Arial"/>
+              </w:rPr>
+              <w:t>00</w:t>
+            </w:r>
+            <w:r>
+              <w:rPr>
+                <w:rFonts w:eastAsia="Arial" w:cs="Arial"/>
+              </w:rPr>
+              <w:t xml:space="preserve"> (max 500)</w:t>
+            </w:r>
+            <w:r>
+              <w:rPr>
+                <w:rFonts w:eastAsia="Arial" w:cs="Arial"/>
+              </w:rPr>
+              <w:t xml:space="preserve"> words on how you define machine learning and human learning, their relationship, and the question you most want answered. Written in the first fortnight. Not graded.</w:t>
             </w:r>
           </w:p>
         </w:tc>
@@ -3011,7 +3134,7 @@
               <w:rPr>
                 <w:rFonts w:eastAsia="Arial" w:cs="Arial"/>
               </w:rPr>
-              <w:t>One cycle per concept, Sessions 2–6: notes from the readings, lecture and discussion; a chat session with your preferred AI system; a copy-then-revise pass over your previous responses; peer review in class; and a short reflective note in which you grade your own contribution.</w:t>
+              <w:t>One cycle per concept, Sessions 2–6: notes from the readings, lecture and discussion; a chat session with your preferred AI system; a copy-then-revise pass over your previous responses; and a short reflective note in which you grade your own contribution.</w:t>
             </w:r>
             <w:r>
               <w:rPr>
@@ -3289,14 +3412,14 @@
               <w:rPr>
                 <w:rFonts w:eastAsia="Arial" w:cs="Arial"/>
               </w:rPr>
-              <w:t xml:space="preserve">A summative report, essay, or curriculum design synthesizing the course materials and building directly on the five </w:t>
+              <w:t xml:space="preserve">A summative report, essay, or curriculum design synthesizing the course materials and building </w:t>
             </w:r>
             <w:r>
               <w:rPr>
                 <w:rFonts w:eastAsia="Arial" w:cs="Arial"/>
               </w:rPr>
               <w:lastRenderedPageBreak/>
-              <w:t>formative iterations. Its exact form is settled together during the term. Due Fri 16 Oct.</w:t>
+              <w:t>directly on the five formative iterations. Its exact form is settled together during the term. Due Fri 16 Oct.</w:t>
             </w:r>
           </w:p>
         </w:tc>
@@ -5531,36 +5654,26 @@
                 <w:szCs w:val="24"/>
               </w:rPr>
             </w:pPr>
-            <w:r>
-              <w:fldChar w:fldCharType="begin"/>
-            </w:r>
-            <w:r>
-              <w:instrText>HYPERLINK "https://cgscholar.com/posts/1849?communityId=150" \t "_blank"</w:instrText>
-            </w:r>
-            <w:r>
-              <w:fldChar w:fldCharType="separate"/>
-            </w:r>
-            <w:r>
-              <w:rPr>
-                <w:rStyle w:val="Hyperlink"/>
-              </w:rPr>
-              <w:t>Week 1 (August 24) - S</w:t>
-            </w:r>
-            <w:r>
-              <w:rPr>
-                <w:rStyle w:val="Hyperlink"/>
-              </w:rPr>
-              <w:t>y</w:t>
-            </w:r>
-            <w:r>
-              <w:rPr>
-                <w:rStyle w:val="Hyperlink"/>
-              </w:rPr>
-              <w:t>nthesis</w:t>
-            </w:r>
-            <w:r>
-              <w:fldChar w:fldCharType="end"/>
-            </w:r>
+            <w:hyperlink r:id="rId40" w:tgtFrame="_blank" w:history="1">
+              <w:r>
+                <w:rPr>
+                  <w:rStyle w:val="Hyperlink"/>
+                </w:rPr>
+                <w:t>Week 1 (August 24) - S</w:t>
+              </w:r>
+              <w:r>
+                <w:rPr>
+                  <w:rStyle w:val="Hyperlink"/>
+                </w:rPr>
+                <w:t>y</w:t>
+              </w:r>
+              <w:r>
+                <w:rPr>
+                  <w:rStyle w:val="Hyperlink"/>
+                </w:rPr>
+                <w:t>nthesis</w:t>
+              </w:r>
+            </w:hyperlink>
             <w:r>
               <w:br/>
             </w:r>
@@ -5686,7 +5799,7 @@
                 <w:szCs w:val="24"/>
               </w:rPr>
             </w:pPr>
-            <w:hyperlink r:id="rId40" w:tgtFrame="_blank" w:history="1">
+            <w:hyperlink r:id="rId41" w:tgtFrame="_blank" w:history="1">
               <w:r>
                 <w:rPr>
                   <w:rStyle w:val="Hyperlink"/>
@@ -5839,7 +5952,7 @@
               </w:rPr>
               <w:br/>
             </w:r>
-            <w:hyperlink r:id="rId41" w:tgtFrame="_blank" w:history="1">
+            <w:hyperlink r:id="rId42" w:tgtFrame="_blank" w:history="1">
               <w:r>
                 <w:rPr>
                   <w:rStyle w:val="Hyperlink"/>
@@ -5951,7 +6064,7 @@
                 <w:szCs w:val="24"/>
               </w:rPr>
             </w:pPr>
-            <w:hyperlink r:id="rId42" w:tgtFrame="_blank" w:history="1">
+            <w:hyperlink r:id="rId43" w:tgtFrame="_blank" w:history="1">
               <w:r>
                 <w:rPr>
                   <w:rStyle w:val="Hyperlink"/>
@@ -5994,6 +6107,137 @@
                 <w:szCs w:val="24"/>
               </w:rPr>
             </w:pPr>
+          </w:p>
+        </w:tc>
+      </w:tr>
+      <w:tr>
+        <w:tc>
+          <w:tcPr>
+            <w:tcW w:w="2535" w:type="dxa"/>
+          </w:tcPr>
+          <w:p>
+            <w:pPr>
+              <w:rPr>
+                <w:sz w:val="24"/>
+                <w:szCs w:val="24"/>
+              </w:rPr>
+            </w:pPr>
+            <w:r>
+              <w:rPr>
+                <w:sz w:val="24"/>
+                <w:szCs w:val="24"/>
+              </w:rPr>
+              <w:t>Session 4</w:t>
+            </w:r>
+          </w:p>
+          <w:p>
+            <w:pPr>
+              <w:rPr>
+                <w:sz w:val="24"/>
+                <w:szCs w:val="24"/>
+              </w:rPr>
+            </w:pPr>
+            <w:r>
+              <w:rPr>
+                <w:sz w:val="24"/>
+                <w:szCs w:val="24"/>
+              </w:rPr>
+              <w:t>Mon 21 Sep</w:t>
+            </w:r>
+          </w:p>
+        </w:tc>
+        <w:tc>
+          <w:tcPr>
+            <w:tcW w:w="3450" w:type="dxa"/>
+          </w:tcPr>
+          <w:p>
+            <w:pPr>
+              <w:pStyle w:val="ListBullet"/>
+              <w:rPr>
+                <w:sz w:val="24"/>
+                <w:szCs w:val="24"/>
+              </w:rPr>
+            </w:pPr>
+            <w:r>
+              <w:rPr>
+                <w:sz w:val="24"/>
+                <w:szCs w:val="24"/>
+              </w:rPr>
+              <w:t>Attention</w:t>
+            </w:r>
+          </w:p>
+        </w:tc>
+        <w:tc>
+          <w:tcPr>
+            <w:tcW w:w="3365" w:type="dxa"/>
+          </w:tcPr>
+          <w:p>
+            <w:pPr>
+              <w:rPr>
+                <w:sz w:val="24"/>
+                <w:szCs w:val="24"/>
+              </w:rPr>
+            </w:pPr>
+            <w:hyperlink r:id="rId44" w:tgtFrame="_blank" w:history="1">
+              <w:r>
+                <w:rPr>
+                  <w:rStyle w:val="Hyperlink"/>
+                  <w:sz w:val="24"/>
+                  <w:szCs w:val="24"/>
+                </w:rPr>
+                <w:t>Week 4 (September 21) - Attention</w:t>
+              </w:r>
+            </w:hyperlink>
+            <w:r>
+              <w:rPr>
+                <w:sz w:val="24"/>
+                <w:szCs w:val="24"/>
+              </w:rPr>
+              <w:br/>
+            </w:r>
+            <w:r>
+              <w:rPr>
+                <w:sz w:val="24"/>
+                <w:szCs w:val="24"/>
+              </w:rPr>
+              <w:br/>
+            </w:r>
+            <w:r>
+              <w:rPr>
+                <w:sz w:val="24"/>
+                <w:szCs w:val="24"/>
+              </w:rPr>
+              <w:t>Formative self-assessment 3</w:t>
+            </w:r>
+          </w:p>
+          <w:p>
+            <w:pPr>
+              <w:rPr>
+                <w:sz w:val="24"/>
+                <w:szCs w:val="24"/>
+              </w:rPr>
+            </w:pPr>
+            <w:r>
+              <w:rPr>
+                <w:sz w:val="24"/>
+                <w:szCs w:val="24"/>
+              </w:rPr>
+              <w:t>Instructor commentary returned</w:t>
+            </w:r>
+            <w:r>
+              <w:rPr>
+                <w:sz w:val="24"/>
+                <w:szCs w:val="24"/>
+              </w:rPr>
+              <w:br/>
+            </w:r>
+            <w:r>
+              <w:rPr>
+                <w:sz w:val="24"/>
+                <w:szCs w:val="24"/>
+              </w:rPr>
+              <w:br/>
+            </w:r>
             <w:r>
               <w:rPr>
                 <w:sz w:val="24"/>
@@ -6029,7 +6273,7 @@
                 <w:sz w:val="24"/>
                 <w:szCs w:val="24"/>
               </w:rPr>
-              <w:t>Session 4</w:t>
+              <w:t>Session 5</w:t>
             </w:r>
           </w:p>
           <w:p>
@@ -6044,7 +6288,7 @@
                 <w:sz w:val="24"/>
                 <w:szCs w:val="24"/>
               </w:rPr>
-              <w:t>Mon 21 Sep</w:t>
+              <w:t>Mon 28 Sep</w:t>
             </w:r>
           </w:p>
         </w:tc>
@@ -6065,7 +6309,23 @@
                 <w:sz w:val="24"/>
                 <w:szCs w:val="24"/>
               </w:rPr>
-              <w:t>Attention</w:t>
+              <w:t>Alignment</w:t>
+            </w:r>
+          </w:p>
+          <w:p>
+            <w:pPr>
+              <w:pStyle w:val="ListBullet"/>
+              <w:rPr>
+                <w:sz w:val="24"/>
+                <w:szCs w:val="24"/>
+              </w:rPr>
+            </w:pPr>
+            <w:r>
+              <w:rPr>
+                <w:sz w:val="24"/>
+                <w:szCs w:val="24"/>
+              </w:rPr>
+              <w:t>Whose values, translated by whom, into what rewards</w:t>
             </w:r>
           </w:p>
         </w:tc>
@@ -6080,14 +6340,14 @@
                 <w:szCs w:val="24"/>
               </w:rPr>
             </w:pPr>
-            <w:hyperlink r:id="rId43" w:tgtFrame="_blank" w:history="1">
+            <w:hyperlink r:id="rId45" w:tgtFrame="_blank" w:history="1">
               <w:r>
                 <w:rPr>
                   <w:rStyle w:val="Hyperlink"/>
                   <w:sz w:val="24"/>
                   <w:szCs w:val="24"/>
                 </w:rPr>
-                <w:t>Week 4 (September 21) - Attention</w:t>
+                <w:t>Week 5 (September 28) - Alignment</w:t>
               </w:r>
             </w:hyperlink>
             <w:r>
@@ -6109,22 +6369,7 @@
                 <w:sz w:val="24"/>
                 <w:szCs w:val="24"/>
               </w:rPr>
-              <w:t>Formative self-assessment 3</w:t>
-            </w:r>
-          </w:p>
-          <w:p>
-            <w:pPr>
-              <w:rPr>
-                <w:sz w:val="24"/>
-                <w:szCs w:val="24"/>
-              </w:rPr>
-            </w:pPr>
-            <w:r>
-              <w:rPr>
-                <w:sz w:val="24"/>
-                <w:szCs w:val="24"/>
-              </w:rPr>
-              <w:t>Instructor commentary returned</w:t>
+              <w:t>Formative self-assessment 4</w:t>
             </w:r>
           </w:p>
           <w:p>
@@ -6154,7 +6399,7 @@
                 <w:sz w:val="24"/>
                 <w:szCs w:val="24"/>
               </w:rPr>
-              <w:t>Session 5</w:t>
+              <w:t>Session 6</w:t>
             </w:r>
           </w:p>
           <w:p>
@@ -6169,7 +6414,8 @@
                 <w:sz w:val="24"/>
                 <w:szCs w:val="24"/>
               </w:rPr>
-              <w:t>Mon 28 Sep</w:t>
+              <w:lastRenderedPageBreak/>
+              <w:t>Mon 5 Oct</w:t>
             </w:r>
           </w:p>
         </w:tc>
@@ -6190,7 +6436,8 @@
                 <w:sz w:val="24"/>
                 <w:szCs w:val="24"/>
               </w:rPr>
-              <w:t>Alignment</w:t>
+              <w:lastRenderedPageBreak/>
+              <w:t>Critique</w:t>
             </w:r>
           </w:p>
           <w:p>
@@ -6206,7 +6453,8 @@
                 <w:sz w:val="24"/>
                 <w:szCs w:val="24"/>
               </w:rPr>
-              <w:t>Whose values, translated by whom, into what rewards</w:t>
+              <w:lastRenderedPageBreak/>
+              <w:t>Immanent rather than merely external critique</w:t>
             </w:r>
           </w:p>
         </w:tc>
@@ -6221,36 +6469,13 @@
                 <w:szCs w:val="24"/>
               </w:rPr>
             </w:pPr>
-            <w:hyperlink r:id="rId44" w:tgtFrame="_blank" w:history="1">
-              <w:r>
-                <w:rPr>
-                  <w:rStyle w:val="Hyperlink"/>
-                  <w:sz w:val="24"/>
-                  <w:szCs w:val="24"/>
-                </w:rPr>
-                <w:t>Week 5 (September 28) - Alignment</w:t>
-              </w:r>
-            </w:hyperlink>
             <w:r>
               <w:rPr>
                 <w:sz w:val="24"/>
                 <w:szCs w:val="24"/>
               </w:rPr>
-              <w:br/>
-            </w:r>
-            <w:r>
-              <w:rPr>
-                <w:sz w:val="24"/>
-                <w:szCs w:val="24"/>
-              </w:rPr>
-              <w:br/>
-            </w:r>
-            <w:r>
-              <w:rPr>
-                <w:sz w:val="24"/>
-                <w:szCs w:val="24"/>
-              </w:rPr>
-              <w:t>Formative self-assessment 4</w:t>
+              <w:lastRenderedPageBreak/>
+              <w:t>Formative self-assessment 5</w:t>
             </w:r>
           </w:p>
           <w:p>
@@ -6260,27 +6485,48 @@
                 <w:szCs w:val="24"/>
               </w:rPr>
             </w:pPr>
-          </w:p>
-        </w:tc>
-      </w:tr>
-      <w:tr>
-        <w:tc>
-          <w:tcPr>
-            <w:tcW w:w="2535" w:type="dxa"/>
-          </w:tcPr>
-          <w:p>
-            <w:pPr>
+            <w:r>
               <w:rPr>
                 <w:sz w:val="24"/>
                 <w:szCs w:val="24"/>
               </w:rPr>
-            </w:pPr>
+              <w:lastRenderedPageBreak/>
+              <w:fldChar w:fldCharType="begin"/>
+            </w:r>
             <w:r>
               <w:rPr>
                 <w:sz w:val="24"/>
                 <w:szCs w:val="24"/>
               </w:rPr>
-              <w:t>Session 6</w:t>
+              <w:instrText>HYPERLINK "https://cgscholar.com/posts/1866?communityId=150" \t "_blank"</w:instrText>
+            </w:r>
+            <w:r>
+              <w:rPr>
+                <w:sz w:val="24"/>
+                <w:szCs w:val="24"/>
+              </w:rPr>
+            </w:r>
+            <w:r>
+              <w:rPr>
+                <w:sz w:val="24"/>
+                <w:szCs w:val="24"/>
+              </w:rPr>
+              <w:fldChar w:fldCharType="separate"/>
+            </w:r>
+            <w:r>
+              <w:rPr>
+                <w:rStyle w:val="Hyperlink"/>
+                <w:sz w:val="24"/>
+                <w:szCs w:val="24"/>
+              </w:rPr>
+              <w:t>Week 6 (October 5) - Critique</w:t>
+            </w:r>
+            <w:r>
+              <w:rPr>
+                <w:sz w:val="24"/>
+                <w:szCs w:val="24"/>
+              </w:rPr>
+              <w:fldChar w:fldCharType="end"/>
             </w:r>
           </w:p>
           <w:p>
@@ -6295,35 +6541,11 @@
                 <w:sz w:val="24"/>
                 <w:szCs w:val="24"/>
               </w:rPr>
-              <w:lastRenderedPageBreak/>
-              <w:t>Mon 5 Oct</w:t>
-            </w:r>
-          </w:p>
-        </w:tc>
-        <w:tc>
-          <w:tcPr>
-            <w:tcW w:w="3450" w:type="dxa"/>
-          </w:tcPr>
-          <w:p>
-            <w:pPr>
-              <w:pStyle w:val="ListBullet"/>
-              <w:rPr>
-                <w:sz w:val="24"/>
-                <w:szCs w:val="24"/>
-              </w:rPr>
-            </w:pPr>
-            <w:r>
-              <w:rPr>
-                <w:sz w:val="24"/>
-                <w:szCs w:val="24"/>
-              </w:rPr>
-              <w:lastRenderedPageBreak/>
-              <w:t>Critique</w:t>
+              <w:t xml:space="preserve">Peer commentary 2: three comments on peers’ revised responses </w:t>
             </w:r>
           </w:p>
           <w:p>
             <w:pPr>
-              <w:pStyle w:val="ListBullet"/>
               <w:rPr>
                 <w:sz w:val="24"/>
                 <w:szCs w:val="24"/>
@@ -6334,69 +6556,7 @@
                 <w:sz w:val="24"/>
                 <w:szCs w:val="24"/>
               </w:rPr>
-              <w:lastRenderedPageBreak/>
-              <w:t>Immanent rather than merely external critique</w:t>
-            </w:r>
-          </w:p>
-        </w:tc>
-        <w:tc>
-          <w:tcPr>
-            <w:tcW w:w="3365" w:type="dxa"/>
-          </w:tcPr>
-          <w:p>
-            <w:pPr>
-              <w:rPr>
-                <w:sz w:val="24"/>
-                <w:szCs w:val="24"/>
-              </w:rPr>
-            </w:pPr>
-            <w:r>
-              <w:rPr>
-                <w:sz w:val="24"/>
-                <w:szCs w:val="24"/>
-              </w:rPr>
-              <w:lastRenderedPageBreak/>
-              <w:t>Formative self-assessment 5</w:t>
-            </w:r>
-          </w:p>
-          <w:p>
-            <w:pPr>
-              <w:rPr>
-                <w:sz w:val="24"/>
-                <w:szCs w:val="24"/>
-              </w:rPr>
-            </w:pPr>
-            <w:hyperlink r:id="rId45" w:tgtFrame="_blank" w:history="1">
-              <w:r>
-                <w:rPr>
-                  <w:rStyle w:val="Hyperlink"/>
-                  <w:sz w:val="24"/>
-                  <w:szCs w:val="24"/>
-                </w:rPr>
-                <w:t>Week 6 (October 5) - Critique</w:t>
-              </w:r>
-            </w:hyperlink>
-            <w:r>
-              <w:rPr>
-                <w:sz w:val="24"/>
-                <w:szCs w:val="24"/>
-              </w:rPr>
-              <w:br/>
-            </w:r>
-          </w:p>
-          <w:p>
-            <w:pPr>
-              <w:rPr>
-                <w:sz w:val="24"/>
-                <w:szCs w:val="24"/>
-              </w:rPr>
-            </w:pPr>
-            <w:r>
-              <w:rPr>
-                <w:sz w:val="24"/>
-                <w:szCs w:val="24"/>
-              </w:rPr>
-              <w:t>Peer commentary 2: three comments on peers’ revised responses</w:t>
+              <w:t>Instructor commentary returned</w:t>
             </w:r>
           </w:p>
         </w:tc>
@@ -6545,21 +6705,6 @@
                 <w:szCs w:val="24"/>
               </w:rPr>
               <w:t>o self-assessment: the session is given over to the final report</w:t>
-            </w:r>
-          </w:p>
-          <w:p>
-            <w:pPr>
-              <w:rPr>
-                <w:sz w:val="24"/>
-                <w:szCs w:val="24"/>
-              </w:rPr>
-            </w:pPr>
-            <w:r>
-              <w:rPr>
-                <w:sz w:val="24"/>
-                <w:szCs w:val="24"/>
-              </w:rPr>
-              <w:t>Instructor commentary returned</w:t>
             </w:r>
           </w:p>
           <w:p>

</xml_diff>

<commit_message>
Publish: 10 file(s) updated (articles/ai-tutor/tutor-blueprint.html, ...)
</commit_message>
<xml_diff>
--- a/courses/479-fall-2026/syllabus/University of Illinois Urbana-Champaign Syllabus 479 Fall 2026.docx
+++ b/courses/479-fall-2026/syllabus/University of Illinois Urbana-Champaign Syllabus 479 Fall 2026.docx
@@ -1528,7 +1528,13 @@
               <w:pStyle w:val="TableParagraph"/>
             </w:pPr>
             <w:r>
-              <w:t>Peer commentary (Sessions 3 and 6)</w:t>
+              <w:t xml:space="preserve">Peer commentary (Sessions </w:t>
+            </w:r>
+            <w:r>
+              <w:t>4</w:t>
+            </w:r>
+            <w:r>
+              <w:t xml:space="preserve"> and 6)</w:t>
             </w:r>
             <w:r>
               <w:rPr>
@@ -3297,7 +3303,49 @@
               <w:rPr>
                 <w:rFonts w:eastAsia="Arial" w:cs="Arial"/>
               </w:rPr>
-              <w:t>Read and comment on a peer’s revised responses, three comments in Session 3 and three more in Session 6. A hurdle requirement: awarded on completion in good faith, not graded on quality.</w:t>
+              <w:t xml:space="preserve">Read and comment on a peer’s revised responses, three comments in </w:t>
+            </w:r>
+            <w:r>
+              <w:rPr>
+                <w:rFonts w:eastAsia="Arial" w:cs="Arial"/>
+              </w:rPr>
+              <w:t>Week</w:t>
+            </w:r>
+            <w:r>
+              <w:rPr>
+                <w:rFonts w:eastAsia="Arial" w:cs="Arial"/>
+              </w:rPr>
+              <w:t xml:space="preserve"> </w:t>
+            </w:r>
+            <w:r>
+              <w:rPr>
+                <w:rFonts w:eastAsia="Arial" w:cs="Arial"/>
+              </w:rPr>
+              <w:t>4</w:t>
+            </w:r>
+            <w:r>
+              <w:rPr>
+                <w:rFonts w:eastAsia="Arial" w:cs="Arial"/>
+              </w:rPr>
+              <w:t xml:space="preserve"> and three more in </w:t>
+            </w:r>
+            <w:r>
+              <w:rPr>
+                <w:rFonts w:eastAsia="Arial" w:cs="Arial"/>
+              </w:rPr>
+              <w:t>Week</w:t>
+            </w:r>
+            <w:r>
+              <w:rPr>
+                <w:rFonts w:eastAsia="Arial" w:cs="Arial"/>
+              </w:rPr>
+              <w:t xml:space="preserve"> </w:t>
+            </w:r>
+            <w:r>
+              <w:rPr>
+                <w:rFonts w:eastAsia="Arial" w:cs="Arial"/>
+              </w:rPr>
+              <w:t>6. A hurdle requirement: awarded on completion in good faith, not graded on quality.</w:t>
             </w:r>
           </w:p>
         </w:tc>
@@ -6154,12 +6202,16 @@
             <w:pPr>
               <w:pStyle w:val="ListBullet"/>
               <w:rPr>
+                <w:i/>
+                <w:iCs/>
                 <w:sz w:val="24"/>
                 <w:szCs w:val="24"/>
               </w:rPr>
             </w:pPr>
             <w:r>
               <w:rPr>
+                <w:i/>
+                <w:iCs/>
                 <w:sz w:val="24"/>
                 <w:szCs w:val="24"/>
               </w:rPr>
@@ -6300,12 +6352,16 @@
             <w:pPr>
               <w:pStyle w:val="ListBullet"/>
               <w:rPr>
+                <w:i/>
+                <w:iCs/>
                 <w:sz w:val="24"/>
                 <w:szCs w:val="24"/>
               </w:rPr>
             </w:pPr>
             <w:r>
               <w:rPr>
+                <w:i/>
+                <w:iCs/>
                 <w:sz w:val="24"/>
                 <w:szCs w:val="24"/>
               </w:rPr>
@@ -6315,18 +6371,16 @@
           <w:p>
             <w:pPr>
               <w:pStyle w:val="ListBullet"/>
+              <w:numPr>
+                <w:ilvl w:val="0"/>
+                <w:numId w:val="0"/>
+              </w:numPr>
+              <w:ind w:left="360"/>
               <w:rPr>
                 <w:sz w:val="24"/>
                 <w:szCs w:val="24"/>
               </w:rPr>
             </w:pPr>
-            <w:r>
-              <w:rPr>
-                <w:sz w:val="24"/>
-                <w:szCs w:val="24"/>
-              </w:rPr>
-              <w:t>Whose values, translated by whom, into what rewards</w:t>
-            </w:r>
           </w:p>
         </w:tc>
         <w:tc>
@@ -6427,12 +6481,16 @@
             <w:pPr>
               <w:pStyle w:val="ListBullet"/>
               <w:rPr>
+                <w:i/>
+                <w:iCs/>
                 <w:sz w:val="24"/>
                 <w:szCs w:val="24"/>
               </w:rPr>
             </w:pPr>
             <w:r>
               <w:rPr>
+                <w:i/>
+                <w:iCs/>
                 <w:sz w:val="24"/>
                 <w:szCs w:val="24"/>
               </w:rPr>
@@ -6444,17 +6502,30 @@
             <w:pPr>
               <w:pStyle w:val="ListBullet"/>
               <w:rPr>
+                <w:i/>
+                <w:iCs/>
                 <w:sz w:val="24"/>
                 <w:szCs w:val="24"/>
               </w:rPr>
             </w:pPr>
             <w:r>
               <w:rPr>
+                <w:i/>
+                <w:iCs/>
                 <w:sz w:val="24"/>
                 <w:szCs w:val="24"/>
               </w:rPr>
               <w:lastRenderedPageBreak/>
-              <w:t>Immanent rather than merely external critique</w:t>
+              <w:t>C</w:t>
+            </w:r>
+            <w:r>
+              <w:rPr>
+                <w:i/>
+                <w:iCs/>
+                <w:sz w:val="24"/>
+                <w:szCs w:val="24"/>
+              </w:rPr>
+              <w:t>ritique</w:t>
             </w:r>
           </w:p>
         </w:tc>
@@ -6485,49 +6556,16 @@
                 <w:szCs w:val="24"/>
               </w:rPr>
             </w:pPr>
-            <w:r>
-              <w:rPr>
-                <w:sz w:val="24"/>
-                <w:szCs w:val="24"/>
-              </w:rPr>
-              <w:lastRenderedPageBreak/>
-              <w:fldChar w:fldCharType="begin"/>
-            </w:r>
-            <w:r>
-              <w:rPr>
-                <w:sz w:val="24"/>
-                <w:szCs w:val="24"/>
-              </w:rPr>
-              <w:instrText>HYPERLINK "https://cgscholar.com/posts/1866?communityId=150" \t "_blank"</w:instrText>
-            </w:r>
-            <w:r>
-              <w:rPr>
-                <w:sz w:val="24"/>
-                <w:szCs w:val="24"/>
-              </w:rPr>
-            </w:r>
-            <w:r>
-              <w:rPr>
-                <w:sz w:val="24"/>
-                <w:szCs w:val="24"/>
-              </w:rPr>
-              <w:fldChar w:fldCharType="separate"/>
-            </w:r>
-            <w:r>
-              <w:rPr>
-                <w:rStyle w:val="Hyperlink"/>
-                <w:sz w:val="24"/>
-                <w:szCs w:val="24"/>
-              </w:rPr>
-              <w:t>Week 6 (October 5) - Critique</w:t>
-            </w:r>
-            <w:r>
-              <w:rPr>
-                <w:sz w:val="24"/>
-                <w:szCs w:val="24"/>
-              </w:rPr>
-              <w:fldChar w:fldCharType="end"/>
-            </w:r>
+            <w:hyperlink r:id="rId46" w:tgtFrame="_blank" w:history="1">
+              <w:r>
+                <w:rPr>
+                  <w:rStyle w:val="Hyperlink"/>
+                  <w:sz w:val="24"/>
+                  <w:szCs w:val="24"/>
+                </w:rPr>
+                <w:t>Week 6 (October 5) - Critique</w:t>
+              </w:r>
+            </w:hyperlink>
           </w:p>
           <w:p>
             <w:pPr>
@@ -6541,7 +6579,14 @@
                 <w:sz w:val="24"/>
                 <w:szCs w:val="24"/>
               </w:rPr>
-              <w:t xml:space="preserve">Peer commentary 2: three comments on peers’ revised responses </w:t>
+              <w:t>Instructor commentary returned</w:t>
+            </w:r>
+            <w:r>
+              <w:rPr>
+                <w:sz w:val="24"/>
+                <w:szCs w:val="24"/>
+              </w:rPr>
+              <w:t xml:space="preserve"> </w:t>
             </w:r>
           </w:p>
           <w:p>
@@ -6556,8 +6601,16 @@
                 <w:sz w:val="24"/>
                 <w:szCs w:val="24"/>
               </w:rPr>
-              <w:t>Instructor commentary returned</w:t>
-            </w:r>
+              <w:t xml:space="preserve">Peer commentary 2: three comments on peers’ revised responses </w:t>
+            </w:r>
+          </w:p>
+          <w:p>
+            <w:pPr>
+              <w:rPr>
+                <w:sz w:val="24"/>
+                <w:szCs w:val="24"/>
+              </w:rPr>
+            </w:pPr>
           </w:p>
         </w:tc>
       </w:tr>
@@ -6613,6 +6666,8 @@
             <w:proofErr w:type="spellStart"/>
             <w:r>
               <w:rPr>
+                <w:i/>
+                <w:iCs/>
                 <w:sz w:val="24"/>
                 <w:szCs w:val="24"/>
               </w:rPr>
@@ -6620,6 +6675,8 @@
             </w:r>
             <w:r>
               <w:rPr>
+                <w:i/>
+                <w:iCs/>
                 <w:sz w:val="24"/>
                 <w:szCs w:val="24"/>
               </w:rPr>
@@ -6631,7 +6688,7 @@
                 <w:sz w:val="24"/>
                 <w:szCs w:val="24"/>
               </w:rPr>
-              <w:t xml:space="preserve"> and history; where the eight concepts leave us</w:t>
+              <w:t xml:space="preserve"> </w:t>
             </w:r>
           </w:p>
         </w:tc>
@@ -6646,7 +6703,7 @@
                 <w:szCs w:val="24"/>
               </w:rPr>
             </w:pPr>
-            <w:hyperlink r:id="rId46" w:tgtFrame="_blank" w:history="1">
+            <w:hyperlink r:id="rId47" w:tgtFrame="_blank" w:history="1">
               <w:r>
                 <w:rPr>
                   <w:rStyle w:val="Hyperlink"/>
@@ -6743,10 +6800,10 @@
     </w:tbl>
     <w:p/>
     <w:sectPr>
-      <w:headerReference w:type="default" r:id="rId47"/>
-      <w:footerReference w:type="even" r:id="rId48"/>
-      <w:footerReference w:type="default" r:id="rId49"/>
-      <w:footerReference w:type="first" r:id="rId50"/>
+      <w:headerReference w:type="default" r:id="rId48"/>
+      <w:footerReference w:type="even" r:id="rId49"/>
+      <w:footerReference w:type="default" r:id="rId50"/>
+      <w:footerReference w:type="first" r:id="rId51"/>
       <w:pgSz w:w="12240" w:h="15840"/>
       <w:pgMar w:top="1440" w:right="1440" w:bottom="1440" w:left="1440" w:header="144" w:footer="288" w:gutter="0"/>
       <w:cols w:space="720"/>

</xml_diff>